<commit_message>
Sprawozdanie L1: charakterystyka mechaniczna (parametry krytyczne), stanowisko 1, tylko wykres 3.1
- dodano zdjęcie stanowiska do badania charakterystyki mechanicznej i tabliczkę
  znamionową silnika pro-MOTOR MS 71 1-4 (rys. 2.1, 2.2, tab. 2.1)
- parametry krytyczne Mk/sk dla 70 % i 55 % Un, obliczenie nk oraz porównanie
  z zależnością Mk ~ U^2, wnioski
- usunięto wykresy rozruchów 3.2-3.4, zostaje przebieg całkowity (rys. 3.1)

Co-authored-by: Maciej <WeaverTech@users.noreply.github.com>
</commit_message>
<xml_diff>
--- a/sprawozdanie_L1/Sprawozdanie_L1_silnik_asynchroniczny.docx
+++ b/sprawozdanie_L1/Sprawozdanie_L1_silnik_asynchroniczny.docx
@@ -1985,7 +1985,7 @@
         <w:rPr>
           <w:rFonts w:asciiTheme="minorHAnsi" w:hAnsiTheme="minorHAnsi" w:cstheme="minorHAnsi"/>
         </w:rPr>
-        <w:t xml:space="preserve">Celem laboratorium było zapoznanie się z budową, zasadą działania oraz podstawowymi właściwościami eksploatacyjnymi trójfazowego silnika asynchronicznego klatkowego, w szczególności z przebiegiem prądu pobieranego z sieci podczas rozruchu i wyznaczenie współczynnika krotności prądu rozruchowego.</w:t>
+        <w:t xml:space="preserve">Celem laboratorium było zapoznanie się z budową, zasadą działania oraz podstawowymi właściwościami eksploatacyjnymi trójfazowego silnika asynchronicznego klatkowego, w szczególności z jego charakterystyką mechaniczną i wpływem napięcia zasilania na parametry krytyczne, a także z przebiegiem prądu pobieranego z sieci podczas rozruchu i wyznaczenie współczynnika krotności prądu rozruchowego.</w:t>
       </w:r>
     </w:p>
     <w:p>
@@ -2189,7 +2189,20 @@
         <w:rPr>
           <w:rFonts w:asciiTheme="minorHAnsi" w:hAnsiTheme="minorHAnsi" w:cstheme="minorHAnsi"/>
         </w:rPr>
-        <w:t xml:space="preserve">rejestrację wartości skutecznych prądów w trzech fazach zasilania podczas trzech kolejnych rozruchów silnika napędzającego wentylator;</w:t>
+        <w:t xml:space="preserve">wyznaczenie charakterystyk mechanicznych M = f(s) silnika przy dwóch wartościach napięcia zasilania (70 % i 55 % U</w:t>
+      </w:r>
+      <w:r>
+        <w:rPr>
+          <w:rFonts w:asciiTheme="minorHAnsi" w:hAnsiTheme="minorHAnsi" w:cstheme="minorHAnsi"/>
+          <w:vertAlign w:val="subscript"/>
+        </w:rPr>
+        <w:t xml:space="preserve">N</w:t>
+      </w:r>
+      <w:r>
+        <w:rPr>
+          <w:rFonts w:asciiTheme="minorHAnsi" w:hAnsiTheme="minorHAnsi" w:cstheme="minorHAnsi"/>
+        </w:rPr>
+        <w:t xml:space="preserve">) oraz określenie momentu, poślizgu i prędkości krytycznej;</w:t>
       </w:r>
     </w:p>
     <w:p>
@@ -2209,7 +2222,7 @@
         <w:rPr>
           <w:rFonts w:asciiTheme="minorHAnsi" w:hAnsiTheme="minorHAnsi" w:cstheme="minorHAnsi"/>
         </w:rPr>
-        <w:t xml:space="preserve">wyznaczenie wartości prądu w stanie ustalonym, maksymalnej wartości prądu podczas rozruchu oraz współczynnika krotności prądu dla każdego pomiaru;</w:t>
+        <w:t xml:space="preserve">rejestrację wartości skutecznych prądów w trzech fazach zasilania podczas trzech kolejnych rozruchów silnika napędzającego wentylator;</w:t>
       </w:r>
     </w:p>
     <w:p>
@@ -2229,6 +2242,26 @@
         <w:rPr>
           <w:rFonts w:asciiTheme="minorHAnsi" w:hAnsiTheme="minorHAnsi" w:cstheme="minorHAnsi"/>
         </w:rPr>
+        <w:t xml:space="preserve">wyznaczenie wartości prądu w stanie ustalonym, maksymalnej wartości prądu podczas rozruchu oraz współczynnika krotności prądu dla każdego pomiaru;</w:t>
+      </w:r>
+    </w:p>
+    <w:p>
+      <w:pPr>
+        <w:pStyle w:val="Akapitzlist"/>
+        <w:numPr>
+          <w:ilvl w:val="0"/>
+          <w:numId w:val="3"/>
+        </w:numPr>
+        <w:ind w:left="567"/>
+        <w:jc w:val="both"/>
+        <w:rPr>
+          <w:rFonts w:asciiTheme="minorHAnsi" w:hAnsiTheme="minorHAnsi" w:cstheme="minorHAnsi"/>
+        </w:rPr>
+      </w:pPr>
+      <w:r>
+        <w:rPr>
+          <w:rFonts w:asciiTheme="minorHAnsi" w:hAnsiTheme="minorHAnsi" w:cstheme="minorHAnsi"/>
+        </w:rPr>
         <w:t xml:space="preserve">wyznaczenie średniej krotności wzrostu prądu z trzech pomiarów oraz sformułowanie wniosków.</w:t>
       </w:r>
     </w:p>
@@ -2267,46 +2300,7 @@
         <w:rPr>
           <w:rFonts w:asciiTheme="minorHAnsi" w:hAnsiTheme="minorHAnsi" w:cstheme="minorHAnsi"/>
         </w:rPr>
-        <w:t xml:space="preserve">Pomiar prądu rozruchowego przeprowadzono na stanowisku przedstawionym na rysunku 2.1. Obiektem badań był trójfazowy silnik asynchroniczny klatkowy napędzający wentylator promieniowy, do którego wylotu przyłączony jest rurociąg. W skład stanowiska wchodzą ponadto: łącznik silnika, przemiennik częstotliwości, cyfrowy miernik parametrów sieci LUMEL oraz komputer PC z oprogramowaniem rejestrującym. Miernik mierzy wartości skuteczne prądów w trzech fazach zasilania (I</w:t>
-      </w:r>
-      <w:r>
-        <w:rPr>
-          <w:rFonts w:asciiTheme="minorHAnsi" w:hAnsiTheme="minorHAnsi" w:cstheme="minorHAnsi"/>
-          <w:vertAlign w:val="subscript"/>
-        </w:rPr>
-        <w:t xml:space="preserve">rms1</w:t>
-      </w:r>
-      <w:r>
-        <w:rPr>
-          <w:rFonts w:asciiTheme="minorHAnsi" w:hAnsiTheme="minorHAnsi" w:cstheme="minorHAnsi"/>
-        </w:rPr>
-        <w:t xml:space="preserve">, I</w:t>
-      </w:r>
-      <w:r>
-        <w:rPr>
-          <w:rFonts w:asciiTheme="minorHAnsi" w:hAnsiTheme="minorHAnsi" w:cstheme="minorHAnsi"/>
-          <w:vertAlign w:val="subscript"/>
-        </w:rPr>
-        <w:t xml:space="preserve">rms2</w:t>
-      </w:r>
-      <w:r>
-        <w:rPr>
-          <w:rFonts w:asciiTheme="minorHAnsi" w:hAnsiTheme="minorHAnsi" w:cstheme="minorHAnsi"/>
-        </w:rPr>
-        <w:t xml:space="preserve">, I</w:t>
-      </w:r>
-      <w:r>
-        <w:rPr>
-          <w:rFonts w:asciiTheme="minorHAnsi" w:hAnsiTheme="minorHAnsi" w:cstheme="minorHAnsi"/>
-          <w:vertAlign w:val="subscript"/>
-        </w:rPr>
-        <w:t xml:space="preserve">rms3</w:t>
-      </w:r>
-      <w:r>
-        <w:rPr>
-          <w:rFonts w:asciiTheme="minorHAnsi" w:hAnsiTheme="minorHAnsi" w:cstheme="minorHAnsi"/>
-        </w:rPr>
-        <w:t xml:space="preserve">), które są zapisywane w komputerze z okresem próbkowania 1 s.</w:t>
+        <w:t xml:space="preserve">Charakterystykę mechaniczną wyznaczono na stanowisku przedstawionym na rysunku 2.1. Badany silnik asynchroniczny zasilany jest z przemiennika częstotliwości, który umożliwia nastawienie wartości napięcia i częstotliwości zasilania. Wał silnika sprzęgnięty jest z alternatorem obciążonym rezystorem, a moment obciążający silnik regulowany jest zmianą prądu wzbudzenia alternatora, dostarczanego z zasilacza laboratoryjnego. Moment obciążenia oraz prędkość obrotowa wału są mierzone i wyświetlane na komputerze PC.</w:t>
       </w:r>
     </w:p>
     <w:p>
@@ -2331,7 +2325,7 @@
         </w:rPr>
         <w:drawing>
           <wp:inline distT="0" distB="0" distL="0" distR="0" wp14:anchorId="3EBB3A72" wp14:editId="2D120201">
-            <wp:extent cx="4680000" cy="3515492"/>
+            <wp:extent cx="5040000" cy="3779011"/>
             <wp:effectExtent l="0" t="0" r="4445" b="5715"/>
             <wp:docPr id="101" name="Obraz 101"/>
             <wp:cNvGraphicFramePr>
@@ -2346,6 +2340,940 @@
                   </pic:nvPicPr>
                   <pic:blipFill rotWithShape="1">
                     <a:blip r:embed="rId14"/>
+                    <a:stretch/>
+                  </pic:blipFill>
+                  <pic:spPr bwMode="auto">
+                    <a:xfrm>
+                      <a:off x="0" y="0"/>
+                      <a:ext cx="5040000" cy="3779011"/>
+                    </a:xfrm>
+                    <a:prstGeom prst="rect">
+                      <a:avLst/>
+                    </a:prstGeom>
+                    <a:ln>
+                      <a:noFill/>
+                    </a:ln>
+                    <a:extLst>
+                      <a:ext uri="{53640926-AAD7-44D8-BBD7-CCE9431645EC}">
+                        <a14:shadowObscured xmlns:a14="http://schemas.microsoft.com/office/drawing/2010/main"/>
+                      </a:ext>
+                    </a:extLst>
+                  </pic:spPr>
+                </pic:pic>
+              </a:graphicData>
+            </a:graphic>
+          </wp:inline>
+        </w:drawing>
+      </w:r>
+    </w:p>
+    <w:p>
+      <w:pPr>
+        <w:pStyle w:val="Legenda"/>
+        <w:spacing w:after="0"/>
+        <w:jc w:val="center"/>
+        <w:rPr>
+          <w:rFonts w:asciiTheme="minorHAnsi" w:hAnsiTheme="minorHAnsi" w:cstheme="minorHAnsi"/>
+          <w:i w:val="0"/>
+          <w:color w:val="auto"/>
+          <w:sz w:val="22"/>
+          <w:szCs w:val="22"/>
+        </w:rPr>
+      </w:pPr>
+      <w:r>
+        <w:rPr>
+          <w:rFonts w:asciiTheme="minorHAnsi" w:hAnsiTheme="minorHAnsi"/>
+          <w:i w:val="0"/>
+          <w:color w:val="auto"/>
+          <w:sz w:val="22"/>
+          <w:szCs w:val="22"/>
+        </w:rPr>
+        <w:t xml:space="preserve">Rys. 2.1. Widok stanowiska do badania charakterystyki mechanicznej silnika</w:t>
+      </w:r>
+    </w:p>
+    <w:p>
+      <w:pPr>
+        <w:ind w:firstLine="284"/>
+        <w:jc w:val="both"/>
+        <w:rPr>
+          <w:rFonts w:asciiTheme="minorHAnsi" w:hAnsiTheme="minorHAnsi" w:cstheme="minorHAnsi"/>
+        </w:rPr>
+      </w:pPr>
+    </w:p>
+    <w:p>
+      <w:pPr>
+        <w:ind w:firstLine="284"/>
+        <w:jc w:val="both"/>
+        <w:rPr>
+          <w:rFonts w:asciiTheme="minorHAnsi" w:hAnsiTheme="minorHAnsi" w:cstheme="minorHAnsi"/>
+        </w:rPr>
+      </w:pPr>
+      <w:r>
+        <w:rPr>
+          <w:rFonts w:asciiTheme="minorHAnsi" w:hAnsiTheme="minorHAnsi" w:cstheme="minorHAnsi"/>
+        </w:rPr>
+        <w:t xml:space="preserve">Na rysunku 2.2 przedstawiono tabliczkę znamionową badanego silnika, a odczytane z niej dane znamionowe zestawiono w tabeli 2.1.</w:t>
+      </w:r>
+    </w:p>
+    <w:p>
+      <w:pPr>
+        <w:ind w:firstLine="284"/>
+        <w:jc w:val="both"/>
+        <w:rPr>
+          <w:rFonts w:asciiTheme="minorHAnsi" w:hAnsiTheme="minorHAnsi" w:cstheme="minorHAnsi"/>
+        </w:rPr>
+      </w:pPr>
+    </w:p>
+    <w:p>
+      <w:pPr>
+        <w:keepNext/>
+        <w:jc w:val="center"/>
+      </w:pPr>
+      <w:r>
+        <w:rPr>
+          <w:rFonts w:asciiTheme="minorHAnsi" w:hAnsiTheme="minorHAnsi" w:cstheme="minorHAnsi"/>
+          <w:noProof/>
+          <w:snapToGrid/>
+        </w:rPr>
+        <w:drawing>
+          <wp:inline distT="0" distB="0" distL="0" distR="0">
+            <wp:extent cx="4320000" cy="2418047"/>
+            <wp:effectExtent l="0" t="0" r="4445" b="5715"/>
+            <wp:docPr id="102" name="Obraz 102"/>
+            <wp:cNvGraphicFramePr>
+              <a:graphicFrameLocks xmlns:a="http://schemas.openxmlformats.org/drawingml/2006/main" noChangeAspect="1"/>
+            </wp:cNvGraphicFramePr>
+            <a:graphic xmlns:a="http://schemas.openxmlformats.org/drawingml/2006/main">
+              <a:graphicData uri="http://schemas.openxmlformats.org/drawingml/2006/picture">
+                <pic:pic xmlns:pic="http://schemas.openxmlformats.org/drawingml/2006/picture">
+                  <pic:nvPicPr>
+                    <pic:cNvPr id="1" name=""/>
+                    <pic:cNvPicPr/>
+                  </pic:nvPicPr>
+                  <pic:blipFill rotWithShape="1">
+                    <a:blip r:embed="rId15"/>
+                    <a:stretch/>
+                  </pic:blipFill>
+                  <pic:spPr bwMode="auto">
+                    <a:xfrm>
+                      <a:off x="0" y="0"/>
+                      <a:ext cx="4320000" cy="2418047"/>
+                    </a:xfrm>
+                    <a:prstGeom prst="rect">
+                      <a:avLst/>
+                    </a:prstGeom>
+                    <a:ln>
+                      <a:noFill/>
+                    </a:ln>
+                    <a:extLst>
+                      <a:ext uri="{53640926-AAD7-44D8-BBD7-CCE9431645EC}">
+                        <a14:shadowObscured xmlns:a14="http://schemas.microsoft.com/office/drawing/2010/main"/>
+                      </a:ext>
+                    </a:extLst>
+                  </pic:spPr>
+                </pic:pic>
+              </a:graphicData>
+            </a:graphic>
+          </wp:inline>
+        </w:drawing>
+      </w:r>
+    </w:p>
+    <w:p>
+      <w:pPr>
+        <w:pStyle w:val="Legenda"/>
+        <w:spacing w:after="0"/>
+        <w:jc w:val="center"/>
+        <w:rPr>
+          <w:rFonts w:asciiTheme="minorHAnsi" w:hAnsiTheme="minorHAnsi" w:cstheme="minorHAnsi"/>
+          <w:i w:val="0"/>
+          <w:color w:val="auto"/>
+          <w:sz w:val="22"/>
+          <w:szCs w:val="22"/>
+        </w:rPr>
+      </w:pPr>
+      <w:r>
+        <w:rPr>
+          <w:rFonts w:asciiTheme="minorHAnsi" w:hAnsiTheme="minorHAnsi"/>
+          <w:i w:val="0"/>
+          <w:color w:val="auto"/>
+          <w:sz w:val="22"/>
+          <w:szCs w:val="22"/>
+        </w:rPr>
+        <w:t xml:space="preserve">Rys. 2.2. Tabliczka znamionowa silnika użytego do badania charakterystyki mechanicznej</w:t>
+      </w:r>
+    </w:p>
+    <w:p>
+      <w:pPr>
+        <w:ind w:firstLine="284"/>
+        <w:jc w:val="both"/>
+        <w:rPr>
+          <w:rFonts w:asciiTheme="minorHAnsi" w:hAnsiTheme="minorHAnsi" w:cstheme="minorHAnsi"/>
+        </w:rPr>
+      </w:pPr>
+    </w:p>
+    <w:p>
+      <w:pPr>
+        <w:ind w:firstLine="284"/>
+        <w:jc w:val="both"/>
+        <w:rPr>
+          <w:rFonts w:asciiTheme="minorHAnsi" w:hAnsiTheme="minorHAnsi" w:cstheme="minorHAnsi"/>
+        </w:rPr>
+      </w:pPr>
+    </w:p>
+    <w:p>
+      <w:pPr>
+        <w:pStyle w:val="Tabela"/>
+        <w:spacing w:before="0" w:line="240" w:lineRule="auto"/>
+        <w:ind w:left="709"/>
+        <w:jc w:val="left"/>
+        <w:rPr>
+          <w:rFonts w:asciiTheme="minorHAnsi" w:hAnsiTheme="minorHAnsi" w:cstheme="minorHAnsi"/>
+          <w:b w:val="0"/>
+          <w:bCs w:val="0"/>
+          <w:sz w:val="22"/>
+        </w:rPr>
+      </w:pPr>
+      <w:r>
+        <w:rPr>
+          <w:rFonts w:asciiTheme="minorHAnsi" w:hAnsiTheme="minorHAnsi" w:cstheme="minorHAnsi"/>
+          <w:b w:val="0"/>
+          <w:bCs w:val="0"/>
+          <w:sz w:val="22"/>
+        </w:rPr>
+        <w:t xml:space="preserve">Tab. 2.1. Dane znamionowe silnika użytego do badania charakterystyki mechanicznej</w:t>
+      </w:r>
+    </w:p>
+    <w:tbl>
+      <w:tblPr>
+        <w:tblW w:w="0" w:type="auto"/>
+        <w:jc w:val="center"/>
+        <w:tblBorders>
+          <w:top w:val="single" w:sz="6" w:space="0" w:color="000000"/>
+          <w:left w:val="single" w:sz="6" w:space="0" w:color="000000"/>
+          <w:bottom w:val="single" w:sz="6" w:space="0" w:color="000000"/>
+          <w:right w:val="single" w:sz="6" w:space="0" w:color="000000"/>
+          <w:insideH w:val="single" w:sz="6" w:space="0" w:color="000000"/>
+          <w:insideV w:val="single" w:sz="6" w:space="0" w:color="000000"/>
+        </w:tblBorders>
+        <w:tblLayout w:type="fixed"/>
+        <w:tblLook w:val="0000" w:firstRow="0" w:lastRow="0" w:firstColumn="0" w:lastColumn="0" w:noHBand="0" w:noVBand="0"/>
+      </w:tblPr>
+      <w:tblGrid>
+        <w:gridCol w:w="3685"/>
+        <w:gridCol w:w="3402"/>
+      </w:tblGrid>
+      <w:tr>
+        <w:trPr>
+          <w:cantSplit/>
+          <w:trHeight w:hRule="exact" w:val="370"/>
+          <w:jc w:val="center"/>
+          <w:tblHeader/>
+        </w:trPr>
+        <w:tc>
+          <w:tcPr>
+            <w:tcW w:w="3685" w:type="dxa"/>
+            <w:vAlign w:val="center"/>
+          </w:tcPr>
+          <w:p>
+            <w:pPr>
+              <w:pStyle w:val="Tabela-wntrze"/>
+              <w:keepNext/>
+              <w:spacing w:before="0" w:after="0"/>
+              <w:rPr>
+                <w:rFonts w:asciiTheme="minorHAnsi" w:hAnsiTheme="minorHAnsi" w:cstheme="minorHAnsi"/>
+                <w:sz w:val="22"/>
+              </w:rPr>
+            </w:pPr>
+            <w:r>
+              <w:rPr>
+                <w:rFonts w:asciiTheme="minorHAnsi" w:hAnsiTheme="minorHAnsi" w:cstheme="minorHAnsi"/>
+                <w:sz w:val="22"/>
+              </w:rPr>
+              <w:t xml:space="preserve">Parametr</w:t>
+            </w:r>
+          </w:p>
+        </w:tc>
+        <w:tc>
+          <w:tcPr>
+            <w:tcW w:w="3402" w:type="dxa"/>
+            <w:vAlign w:val="center"/>
+          </w:tcPr>
+          <w:p>
+            <w:pPr>
+              <w:pStyle w:val="Tabela-wntrze"/>
+              <w:keepNext/>
+              <w:spacing w:before="0" w:after="0"/>
+              <w:rPr>
+                <w:rFonts w:asciiTheme="minorHAnsi" w:hAnsiTheme="minorHAnsi" w:cstheme="minorHAnsi"/>
+                <w:sz w:val="22"/>
+              </w:rPr>
+            </w:pPr>
+            <w:r>
+              <w:rPr>
+                <w:rFonts w:asciiTheme="minorHAnsi" w:hAnsiTheme="minorHAnsi" w:cstheme="minorHAnsi"/>
+                <w:sz w:val="22"/>
+              </w:rPr>
+              <w:t xml:space="preserve">Wartość</w:t>
+            </w:r>
+          </w:p>
+        </w:tc>
+      </w:tr>
+      <w:tr>
+        <w:trPr>
+          <w:cantSplit/>
+          <w:trHeight w:hRule="exact" w:val="370"/>
+          <w:jc w:val="center"/>
+        </w:trPr>
+        <w:tc>
+          <w:tcPr>
+            <w:tcW w:w="3685" w:type="dxa"/>
+            <w:vAlign w:val="center"/>
+          </w:tcPr>
+          <w:p>
+            <w:pPr>
+              <w:pStyle w:val="Tabela-wntrze"/>
+              <w:keepNext/>
+              <w:spacing w:before="0" w:after="0"/>
+              <w:rPr>
+                <w:rFonts w:asciiTheme="minorHAnsi" w:hAnsiTheme="minorHAnsi" w:cstheme="minorHAnsi"/>
+                <w:sz w:val="22"/>
+              </w:rPr>
+            </w:pPr>
+            <w:r>
+              <w:rPr>
+                <w:rFonts w:asciiTheme="minorHAnsi" w:hAnsiTheme="minorHAnsi" w:cstheme="minorHAnsi"/>
+                <w:sz w:val="22"/>
+              </w:rPr>
+              <w:t xml:space="preserve">Producent / typ</w:t>
+            </w:r>
+          </w:p>
+        </w:tc>
+        <w:tc>
+          <w:tcPr>
+            <w:tcW w:w="3402" w:type="dxa"/>
+            <w:vAlign w:val="center"/>
+          </w:tcPr>
+          <w:p>
+            <w:pPr>
+              <w:pStyle w:val="Tabela-wntrze"/>
+              <w:keepNext/>
+              <w:spacing w:before="0" w:after="0"/>
+              <w:rPr>
+                <w:rFonts w:asciiTheme="minorHAnsi" w:hAnsiTheme="minorHAnsi" w:cstheme="minorHAnsi"/>
+                <w:sz w:val="22"/>
+              </w:rPr>
+            </w:pPr>
+            <w:r>
+              <w:rPr>
+                <w:rFonts w:asciiTheme="minorHAnsi" w:hAnsiTheme="minorHAnsi" w:cstheme="minorHAnsi"/>
+                <w:sz w:val="22"/>
+              </w:rPr>
+              <w:t xml:space="preserve">pro-MOTOR / MS 71 1-4</w:t>
+            </w:r>
+          </w:p>
+        </w:tc>
+      </w:tr>
+      <w:tr>
+        <w:trPr>
+          <w:cantSplit/>
+          <w:trHeight w:hRule="exact" w:val="370"/>
+          <w:jc w:val="center"/>
+        </w:trPr>
+        <w:tc>
+          <w:tcPr>
+            <w:tcW w:w="3685" w:type="dxa"/>
+            <w:vAlign w:val="center"/>
+          </w:tcPr>
+          <w:p>
+            <w:pPr>
+              <w:pStyle w:val="Tabela-wntrze"/>
+              <w:keepNext/>
+              <w:spacing w:before="0" w:after="0"/>
+              <w:rPr>
+                <w:rFonts w:asciiTheme="minorHAnsi" w:hAnsiTheme="minorHAnsi" w:cstheme="minorHAnsi"/>
+                <w:sz w:val="22"/>
+              </w:rPr>
+            </w:pPr>
+            <w:r>
+              <w:rPr>
+                <w:rFonts w:asciiTheme="minorHAnsi" w:hAnsiTheme="minorHAnsi" w:cstheme="minorHAnsi"/>
+                <w:sz w:val="22"/>
+              </w:rPr>
+              <w:t xml:space="preserve">Częstotliwość znamionowa f</w:t>
+            </w:r>
+            <w:r>
+              <w:rPr>
+                <w:rFonts w:asciiTheme="minorHAnsi" w:hAnsiTheme="minorHAnsi" w:cstheme="minorHAnsi"/>
+                <w:sz w:val="22"/>
+                <w:vertAlign w:val="subscript"/>
+              </w:rPr>
+              <w:t xml:space="preserve">1</w:t>
+            </w:r>
+          </w:p>
+        </w:tc>
+        <w:tc>
+          <w:tcPr>
+            <w:tcW w:w="3402" w:type="dxa"/>
+            <w:vAlign w:val="center"/>
+          </w:tcPr>
+          <w:p>
+            <w:pPr>
+              <w:pStyle w:val="Tabela-wntrze"/>
+              <w:keepNext/>
+              <w:spacing w:before="0" w:after="0"/>
+              <w:rPr>
+                <w:rFonts w:asciiTheme="minorHAnsi" w:hAnsiTheme="minorHAnsi" w:cstheme="minorHAnsi"/>
+                <w:sz w:val="22"/>
+              </w:rPr>
+            </w:pPr>
+            <w:r>
+              <w:rPr>
+                <w:rFonts w:asciiTheme="minorHAnsi" w:hAnsiTheme="minorHAnsi" w:cstheme="minorHAnsi"/>
+                <w:sz w:val="22"/>
+              </w:rPr>
+              <w:t xml:space="preserve">50 Hz / 60 Hz</w:t>
+            </w:r>
+          </w:p>
+        </w:tc>
+      </w:tr>
+      <w:tr>
+        <w:trPr>
+          <w:cantSplit/>
+          <w:trHeight w:hRule="exact" w:val="370"/>
+          <w:jc w:val="center"/>
+        </w:trPr>
+        <w:tc>
+          <w:tcPr>
+            <w:tcW w:w="3685" w:type="dxa"/>
+            <w:vAlign w:val="center"/>
+          </w:tcPr>
+          <w:p>
+            <w:pPr>
+              <w:pStyle w:val="Tabela-wntrze"/>
+              <w:keepNext/>
+              <w:spacing w:before="0" w:after="0"/>
+              <w:rPr>
+                <w:rFonts w:asciiTheme="minorHAnsi" w:hAnsiTheme="minorHAnsi" w:cstheme="minorHAnsi"/>
+                <w:sz w:val="22"/>
+              </w:rPr>
+            </w:pPr>
+            <w:r>
+              <w:rPr>
+                <w:rFonts w:asciiTheme="minorHAnsi" w:hAnsiTheme="minorHAnsi" w:cstheme="minorHAnsi"/>
+                <w:sz w:val="22"/>
+              </w:rPr>
+              <w:t xml:space="preserve">Moc znamionowa P</w:t>
+            </w:r>
+            <w:r>
+              <w:rPr>
+                <w:rFonts w:asciiTheme="minorHAnsi" w:hAnsiTheme="minorHAnsi" w:cstheme="minorHAnsi"/>
+                <w:sz w:val="22"/>
+                <w:vertAlign w:val="subscript"/>
+              </w:rPr>
+              <w:t xml:space="preserve">N</w:t>
+            </w:r>
+          </w:p>
+        </w:tc>
+        <w:tc>
+          <w:tcPr>
+            <w:tcW w:w="3402" w:type="dxa"/>
+            <w:vAlign w:val="center"/>
+          </w:tcPr>
+          <w:p>
+            <w:pPr>
+              <w:pStyle w:val="Tabela-wntrze"/>
+              <w:keepNext/>
+              <w:spacing w:before="0" w:after="0"/>
+              <w:rPr>
+                <w:rFonts w:asciiTheme="minorHAnsi" w:hAnsiTheme="minorHAnsi" w:cstheme="minorHAnsi"/>
+                <w:sz w:val="22"/>
+              </w:rPr>
+            </w:pPr>
+            <w:r>
+              <w:rPr>
+                <w:rFonts w:asciiTheme="minorHAnsi" w:hAnsiTheme="minorHAnsi" w:cstheme="minorHAnsi"/>
+                <w:sz w:val="22"/>
+              </w:rPr>
+              <w:t xml:space="preserve">0,25 kW / 0,3 kW</w:t>
+            </w:r>
+          </w:p>
+        </w:tc>
+      </w:tr>
+      <w:tr>
+        <w:trPr>
+          <w:cantSplit/>
+          <w:trHeight w:hRule="exact" w:val="370"/>
+          <w:jc w:val="center"/>
+        </w:trPr>
+        <w:tc>
+          <w:tcPr>
+            <w:tcW w:w="3685" w:type="dxa"/>
+            <w:vAlign w:val="center"/>
+          </w:tcPr>
+          <w:p>
+            <w:pPr>
+              <w:pStyle w:val="Tabela-wntrze"/>
+              <w:keepNext/>
+              <w:spacing w:before="0" w:after="0"/>
+              <w:rPr>
+                <w:rFonts w:asciiTheme="minorHAnsi" w:hAnsiTheme="minorHAnsi" w:cstheme="minorHAnsi"/>
+                <w:sz w:val="22"/>
+              </w:rPr>
+            </w:pPr>
+            <w:r>
+              <w:rPr>
+                <w:rFonts w:asciiTheme="minorHAnsi" w:hAnsiTheme="minorHAnsi" w:cstheme="minorHAnsi"/>
+                <w:sz w:val="22"/>
+              </w:rPr>
+              <w:t xml:space="preserve">Napięcie znamionowe (Δ/Y)</w:t>
+            </w:r>
+          </w:p>
+        </w:tc>
+        <w:tc>
+          <w:tcPr>
+            <w:tcW w:w="3402" w:type="dxa"/>
+            <w:vAlign w:val="center"/>
+          </w:tcPr>
+          <w:p>
+            <w:pPr>
+              <w:pStyle w:val="Tabela-wntrze"/>
+              <w:keepNext/>
+              <w:spacing w:before="0" w:after="0"/>
+              <w:rPr>
+                <w:rFonts w:asciiTheme="minorHAnsi" w:hAnsiTheme="minorHAnsi" w:cstheme="minorHAnsi"/>
+                <w:sz w:val="22"/>
+              </w:rPr>
+            </w:pPr>
+            <w:r>
+              <w:rPr>
+                <w:rFonts w:asciiTheme="minorHAnsi" w:hAnsiTheme="minorHAnsi" w:cstheme="minorHAnsi"/>
+                <w:sz w:val="22"/>
+              </w:rPr>
+              <w:t xml:space="preserve">230/400 V / 265/460 V</w:t>
+            </w:r>
+          </w:p>
+        </w:tc>
+      </w:tr>
+      <w:tr>
+        <w:trPr>
+          <w:cantSplit/>
+          <w:trHeight w:hRule="exact" w:val="370"/>
+          <w:jc w:val="center"/>
+        </w:trPr>
+        <w:tc>
+          <w:tcPr>
+            <w:tcW w:w="3685" w:type="dxa"/>
+            <w:vAlign w:val="center"/>
+          </w:tcPr>
+          <w:p>
+            <w:pPr>
+              <w:pStyle w:val="Tabela-wntrze"/>
+              <w:keepNext/>
+              <w:spacing w:before="0" w:after="0"/>
+              <w:rPr>
+                <w:rFonts w:asciiTheme="minorHAnsi" w:hAnsiTheme="minorHAnsi" w:cstheme="minorHAnsi"/>
+                <w:sz w:val="22"/>
+              </w:rPr>
+            </w:pPr>
+            <w:r>
+              <w:rPr>
+                <w:rFonts w:asciiTheme="minorHAnsi" w:hAnsiTheme="minorHAnsi" w:cstheme="minorHAnsi"/>
+                <w:sz w:val="22"/>
+              </w:rPr>
+              <w:t xml:space="preserve">Prąd znamionowy I</w:t>
+            </w:r>
+            <w:r>
+              <w:rPr>
+                <w:rFonts w:asciiTheme="minorHAnsi" w:hAnsiTheme="minorHAnsi" w:cstheme="minorHAnsi"/>
+                <w:sz w:val="22"/>
+                <w:vertAlign w:val="subscript"/>
+              </w:rPr>
+              <w:t xml:space="preserve">N</w:t>
+            </w:r>
+            <w:r>
+              <w:rPr>
+                <w:rFonts w:asciiTheme="minorHAnsi" w:hAnsiTheme="minorHAnsi" w:cstheme="minorHAnsi"/>
+                <w:sz w:val="22"/>
+              </w:rPr>
+              <w:t xml:space="preserve"> (Δ/Y)</w:t>
+            </w:r>
+          </w:p>
+        </w:tc>
+        <w:tc>
+          <w:tcPr>
+            <w:tcW w:w="3402" w:type="dxa"/>
+            <w:vAlign w:val="center"/>
+          </w:tcPr>
+          <w:p>
+            <w:pPr>
+              <w:pStyle w:val="Tabela-wntrze"/>
+              <w:keepNext/>
+              <w:spacing w:before="0" w:after="0"/>
+              <w:rPr>
+                <w:rFonts w:asciiTheme="minorHAnsi" w:hAnsiTheme="minorHAnsi" w:cstheme="minorHAnsi"/>
+                <w:sz w:val="22"/>
+              </w:rPr>
+            </w:pPr>
+            <w:r>
+              <w:rPr>
+                <w:rFonts w:asciiTheme="minorHAnsi" w:hAnsiTheme="minorHAnsi" w:cstheme="minorHAnsi"/>
+                <w:sz w:val="22"/>
+              </w:rPr>
+              <w:t xml:space="preserve">1,45/0,84 A</w:t>
+            </w:r>
+          </w:p>
+        </w:tc>
+      </w:tr>
+      <w:tr>
+        <w:trPr>
+          <w:cantSplit/>
+          <w:trHeight w:hRule="exact" w:val="370"/>
+          <w:jc w:val="center"/>
+        </w:trPr>
+        <w:tc>
+          <w:tcPr>
+            <w:tcW w:w="3685" w:type="dxa"/>
+            <w:vAlign w:val="center"/>
+          </w:tcPr>
+          <w:p>
+            <w:pPr>
+              <w:pStyle w:val="Tabela-wntrze"/>
+              <w:keepNext/>
+              <w:spacing w:before="0" w:after="0"/>
+              <w:rPr>
+                <w:rFonts w:asciiTheme="minorHAnsi" w:hAnsiTheme="minorHAnsi" w:cstheme="minorHAnsi"/>
+                <w:sz w:val="22"/>
+              </w:rPr>
+            </w:pPr>
+            <w:r>
+              <w:rPr>
+                <w:rFonts w:asciiTheme="minorHAnsi" w:hAnsiTheme="minorHAnsi" w:cstheme="minorHAnsi"/>
+                <w:sz w:val="22"/>
+              </w:rPr>
+              <w:t xml:space="preserve">Prędkość znamionowa n</w:t>
+            </w:r>
+            <w:r>
+              <w:rPr>
+                <w:rFonts w:asciiTheme="minorHAnsi" w:hAnsiTheme="minorHAnsi" w:cstheme="minorHAnsi"/>
+                <w:sz w:val="22"/>
+                <w:vertAlign w:val="subscript"/>
+              </w:rPr>
+              <w:t xml:space="preserve">N</w:t>
+            </w:r>
+          </w:p>
+        </w:tc>
+        <w:tc>
+          <w:tcPr>
+            <w:tcW w:w="3402" w:type="dxa"/>
+            <w:vAlign w:val="center"/>
+          </w:tcPr>
+          <w:p>
+            <w:pPr>
+              <w:pStyle w:val="Tabela-wntrze"/>
+              <w:keepNext/>
+              <w:spacing w:before="0" w:after="0"/>
+              <w:rPr>
+                <w:rFonts w:asciiTheme="minorHAnsi" w:hAnsiTheme="minorHAnsi" w:cstheme="minorHAnsi"/>
+                <w:sz w:val="22"/>
+              </w:rPr>
+            </w:pPr>
+            <w:r>
+              <w:rPr>
+                <w:rFonts w:asciiTheme="minorHAnsi" w:hAnsiTheme="minorHAnsi" w:cstheme="minorHAnsi"/>
+                <w:sz w:val="22"/>
+              </w:rPr>
+              <w:t xml:space="preserve">1350 / 1620 obr/min</w:t>
+            </w:r>
+          </w:p>
+        </w:tc>
+      </w:tr>
+      <w:tr>
+        <w:trPr>
+          <w:cantSplit/>
+          <w:trHeight w:hRule="exact" w:val="370"/>
+          <w:jc w:val="center"/>
+        </w:trPr>
+        <w:tc>
+          <w:tcPr>
+            <w:tcW w:w="3685" w:type="dxa"/>
+            <w:vAlign w:val="center"/>
+          </w:tcPr>
+          <w:p>
+            <w:pPr>
+              <w:pStyle w:val="Tabela-wntrze"/>
+              <w:keepNext/>
+              <w:spacing w:before="0" w:after="0"/>
+              <w:rPr>
+                <w:rFonts w:asciiTheme="minorHAnsi" w:hAnsiTheme="minorHAnsi" w:cstheme="minorHAnsi"/>
+                <w:sz w:val="22"/>
+              </w:rPr>
+            </w:pPr>
+            <w:r>
+              <w:rPr>
+                <w:rFonts w:asciiTheme="minorHAnsi" w:hAnsiTheme="minorHAnsi" w:cstheme="minorHAnsi"/>
+                <w:sz w:val="22"/>
+              </w:rPr>
+              <w:t xml:space="preserve">Współczynnik mocy cos φ</w:t>
+            </w:r>
+          </w:p>
+        </w:tc>
+        <w:tc>
+          <w:tcPr>
+            <w:tcW w:w="3402" w:type="dxa"/>
+            <w:vAlign w:val="center"/>
+          </w:tcPr>
+          <w:p>
+            <w:pPr>
+              <w:pStyle w:val="Tabela-wntrze"/>
+              <w:keepNext/>
+              <w:spacing w:before="0" w:after="0"/>
+              <w:rPr>
+                <w:rFonts w:asciiTheme="minorHAnsi" w:hAnsiTheme="minorHAnsi" w:cstheme="minorHAnsi"/>
+                <w:sz w:val="22"/>
+              </w:rPr>
+            </w:pPr>
+            <w:r>
+              <w:rPr>
+                <w:rFonts w:asciiTheme="minorHAnsi" w:hAnsiTheme="minorHAnsi" w:cstheme="minorHAnsi"/>
+                <w:sz w:val="22"/>
+              </w:rPr>
+              <w:t xml:space="preserve">0,72</w:t>
+            </w:r>
+          </w:p>
+        </w:tc>
+      </w:tr>
+      <w:tr>
+        <w:trPr>
+          <w:cantSplit/>
+          <w:trHeight w:hRule="exact" w:val="370"/>
+          <w:jc w:val="center"/>
+        </w:trPr>
+        <w:tc>
+          <w:tcPr>
+            <w:tcW w:w="3685" w:type="dxa"/>
+            <w:vAlign w:val="center"/>
+          </w:tcPr>
+          <w:p>
+            <w:pPr>
+              <w:pStyle w:val="Tabela-wntrze"/>
+              <w:keepNext/>
+              <w:spacing w:before="0" w:after="0"/>
+              <w:rPr>
+                <w:rFonts w:asciiTheme="minorHAnsi" w:hAnsiTheme="minorHAnsi" w:cstheme="minorHAnsi"/>
+                <w:sz w:val="22"/>
+              </w:rPr>
+            </w:pPr>
+            <w:r>
+              <w:rPr>
+                <w:rFonts w:asciiTheme="minorHAnsi" w:hAnsiTheme="minorHAnsi" w:cstheme="minorHAnsi"/>
+                <w:sz w:val="22"/>
+              </w:rPr>
+              <w:t xml:space="preserve">Klasa izolacji / stopień ochrony</w:t>
+            </w:r>
+          </w:p>
+        </w:tc>
+        <w:tc>
+          <w:tcPr>
+            <w:tcW w:w="3402" w:type="dxa"/>
+            <w:vAlign w:val="center"/>
+          </w:tcPr>
+          <w:p>
+            <w:pPr>
+              <w:pStyle w:val="Tabela-wntrze"/>
+              <w:keepNext/>
+              <w:spacing w:before="0" w:after="0"/>
+              <w:rPr>
+                <w:rFonts w:asciiTheme="minorHAnsi" w:hAnsiTheme="minorHAnsi" w:cstheme="minorHAnsi"/>
+                <w:sz w:val="22"/>
+              </w:rPr>
+            </w:pPr>
+            <w:r>
+              <w:rPr>
+                <w:rFonts w:asciiTheme="minorHAnsi" w:hAnsiTheme="minorHAnsi" w:cstheme="minorHAnsi"/>
+                <w:sz w:val="22"/>
+              </w:rPr>
+              <w:t xml:space="preserve">F / IP55</w:t>
+            </w:r>
+          </w:p>
+        </w:tc>
+      </w:tr>
+      <w:tr>
+        <w:trPr>
+          <w:cantSplit/>
+          <w:trHeight w:hRule="exact" w:val="370"/>
+          <w:jc w:val="center"/>
+        </w:trPr>
+        <w:tc>
+          <w:tcPr>
+            <w:tcW w:w="3685" w:type="dxa"/>
+            <w:vAlign w:val="center"/>
+          </w:tcPr>
+          <w:p>
+            <w:pPr>
+              <w:pStyle w:val="Tabela-wntrze"/>
+              <w:spacing w:before="0" w:after="0"/>
+              <w:rPr>
+                <w:rFonts w:asciiTheme="minorHAnsi" w:hAnsiTheme="minorHAnsi" w:cstheme="minorHAnsi"/>
+                <w:sz w:val="22"/>
+              </w:rPr>
+            </w:pPr>
+            <w:r>
+              <w:rPr>
+                <w:rFonts w:asciiTheme="minorHAnsi" w:hAnsiTheme="minorHAnsi" w:cstheme="minorHAnsi"/>
+                <w:sz w:val="22"/>
+              </w:rPr>
+              <w:t xml:space="preserve">Rodzaj pracy / temp. otoczenia</w:t>
+            </w:r>
+          </w:p>
+        </w:tc>
+        <w:tc>
+          <w:tcPr>
+            <w:tcW w:w="3402" w:type="dxa"/>
+            <w:vAlign w:val="center"/>
+          </w:tcPr>
+          <w:p>
+            <w:pPr>
+              <w:pStyle w:val="Tabela-wntrze"/>
+              <w:spacing w:before="0" w:after="0"/>
+              <w:rPr>
+                <w:rFonts w:asciiTheme="minorHAnsi" w:hAnsiTheme="minorHAnsi" w:cstheme="minorHAnsi"/>
+                <w:sz w:val="22"/>
+              </w:rPr>
+            </w:pPr>
+            <w:r>
+              <w:rPr>
+                <w:rFonts w:asciiTheme="minorHAnsi" w:hAnsiTheme="minorHAnsi" w:cstheme="minorHAnsi"/>
+                <w:sz w:val="22"/>
+              </w:rPr>
+              <w:t xml:space="preserve">S1 / 50 °C</w:t>
+            </w:r>
+          </w:p>
+        </w:tc>
+      </w:tr>
+    </w:tbl>
+    <w:p>
+      <w:pPr>
+        <w:ind w:firstLine="284"/>
+        <w:jc w:val="both"/>
+        <w:rPr>
+          <w:rFonts w:asciiTheme="minorHAnsi" w:hAnsiTheme="minorHAnsi" w:cstheme="minorHAnsi"/>
+        </w:rPr>
+      </w:pPr>
+    </w:p>
+    <w:p>
+      <w:pPr>
+        <w:ind w:firstLine="284"/>
+        <w:jc w:val="both"/>
+        <w:rPr>
+          <w:rFonts w:asciiTheme="minorHAnsi" w:hAnsiTheme="minorHAnsi" w:cstheme="minorHAnsi"/>
+        </w:rPr>
+      </w:pPr>
+      <w:r>
+        <w:rPr>
+          <w:rFonts w:asciiTheme="minorHAnsi" w:hAnsiTheme="minorHAnsi" w:cstheme="minorHAnsi"/>
+        </w:rPr>
+        <w:t xml:space="preserve">Silnik ma dwie pary biegunów (p = 2), a jego prędkość synchroniczna przy częstotliwości 50 Hz wynosi 1500 obr/min.</w:t>
+      </w:r>
+    </w:p>
+    <w:p>
+      <w:pPr>
+        <w:ind w:firstLine="284"/>
+        <w:jc w:val="both"/>
+        <w:rPr>
+          <w:rFonts w:asciiTheme="minorHAnsi" w:hAnsiTheme="minorHAnsi" w:cstheme="minorHAnsi"/>
+        </w:rPr>
+      </w:pPr>
+    </w:p>
+    <w:p>
+      <w:pPr>
+        <w:ind w:firstLine="284"/>
+        <w:jc w:val="both"/>
+        <w:rPr>
+          <w:rFonts w:asciiTheme="minorHAnsi" w:hAnsiTheme="minorHAnsi" w:cstheme="minorHAnsi"/>
+        </w:rPr>
+      </w:pPr>
+      <w:r>
+        <w:rPr>
+          <w:rFonts w:asciiTheme="minorHAnsi" w:hAnsiTheme="minorHAnsi" w:cstheme="minorHAnsi"/>
+        </w:rPr>
+        <w:t xml:space="preserve">Pomiar prądu rozruchowego przeprowadzono na stanowisku przedstawionym na rysunku 2.3. Obiektem badań był trójfazowy silnik asynchroniczny klatkowy napędzający wentylator promieniowy, do którego wylotu przyłączony jest rurociąg. W skład stanowiska wchodzą ponadto: łącznik silnika, przemiennik częstotliwości, cyfrowy miernik parametrów sieci LUMEL oraz komputer PC z oprogramowaniem rejestrującym. Miernik mierzy wartości skuteczne prądów w trzech fazach zasilania (I</w:t>
+      </w:r>
+      <w:r>
+        <w:rPr>
+          <w:rFonts w:asciiTheme="minorHAnsi" w:hAnsiTheme="minorHAnsi" w:cstheme="minorHAnsi"/>
+          <w:vertAlign w:val="subscript"/>
+        </w:rPr>
+        <w:t xml:space="preserve">rms1</w:t>
+      </w:r>
+      <w:r>
+        <w:rPr>
+          <w:rFonts w:asciiTheme="minorHAnsi" w:hAnsiTheme="minorHAnsi" w:cstheme="minorHAnsi"/>
+        </w:rPr>
+        <w:t xml:space="preserve">, I</w:t>
+      </w:r>
+      <w:r>
+        <w:rPr>
+          <w:rFonts w:asciiTheme="minorHAnsi" w:hAnsiTheme="minorHAnsi" w:cstheme="minorHAnsi"/>
+          <w:vertAlign w:val="subscript"/>
+        </w:rPr>
+        <w:t xml:space="preserve">rms2</w:t>
+      </w:r>
+      <w:r>
+        <w:rPr>
+          <w:rFonts w:asciiTheme="minorHAnsi" w:hAnsiTheme="minorHAnsi" w:cstheme="minorHAnsi"/>
+        </w:rPr>
+        <w:t xml:space="preserve">, I</w:t>
+      </w:r>
+      <w:r>
+        <w:rPr>
+          <w:rFonts w:asciiTheme="minorHAnsi" w:hAnsiTheme="minorHAnsi" w:cstheme="minorHAnsi"/>
+          <w:vertAlign w:val="subscript"/>
+        </w:rPr>
+        <w:t xml:space="preserve">rms3</w:t>
+      </w:r>
+      <w:r>
+        <w:rPr>
+          <w:rFonts w:asciiTheme="minorHAnsi" w:hAnsiTheme="minorHAnsi" w:cstheme="minorHAnsi"/>
+        </w:rPr>
+        <w:t xml:space="preserve">), które są zapisywane w komputerze z okresem próbkowania 1 s.</w:t>
+      </w:r>
+    </w:p>
+    <w:p>
+      <w:pPr>
+        <w:ind w:firstLine="284"/>
+        <w:jc w:val="both"/>
+        <w:rPr>
+          <w:rFonts w:asciiTheme="minorHAnsi" w:hAnsiTheme="minorHAnsi" w:cstheme="minorHAnsi"/>
+        </w:rPr>
+      </w:pPr>
+    </w:p>
+    <w:p>
+      <w:pPr>
+        <w:keepNext/>
+        <w:jc w:val="center"/>
+      </w:pPr>
+      <w:r>
+        <w:rPr>
+          <w:rFonts w:asciiTheme="minorHAnsi" w:hAnsiTheme="minorHAnsi" w:cstheme="minorHAnsi"/>
+          <w:noProof/>
+          <w:snapToGrid/>
+        </w:rPr>
+        <w:drawing>
+          <wp:inline distT="0" distB="0" distL="0" distR="0">
+            <wp:extent cx="4680000" cy="3515492"/>
+            <wp:effectExtent l="0" t="0" r="4445" b="5715"/>
+            <wp:docPr id="103" name="Obraz 103"/>
+            <wp:cNvGraphicFramePr>
+              <a:graphicFrameLocks xmlns:a="http://schemas.openxmlformats.org/drawingml/2006/main" noChangeAspect="1"/>
+            </wp:cNvGraphicFramePr>
+            <a:graphic xmlns:a="http://schemas.openxmlformats.org/drawingml/2006/main">
+              <a:graphicData uri="http://schemas.openxmlformats.org/drawingml/2006/picture">
+                <pic:pic xmlns:pic="http://schemas.openxmlformats.org/drawingml/2006/picture">
+                  <pic:nvPicPr>
+                    <pic:cNvPr id="1" name=""/>
+                    <pic:cNvPicPr/>
+                  </pic:nvPicPr>
+                  <pic:blipFill rotWithShape="1">
+                    <a:blip r:embed="rId16"/>
                     <a:stretch/>
                   </pic:blipFill>
                   <pic:spPr bwMode="auto">
@@ -2393,7 +3321,7 @@
           <w:sz w:val="22"/>
           <w:szCs w:val="22"/>
         </w:rPr>
-        <w:t xml:space="preserve">Rys. 2.1. Widok stanowiska do badania prądów rozruchowych i parametrów zasilania</w:t>
+        <w:t xml:space="preserve">Rys. 2.3. Widok stanowiska do badania prądów rozruchowych i parametrów zasilania</w:t>
       </w:r>
     </w:p>
     <w:p>
@@ -2417,7 +3345,7 @@
         <w:rPr>
           <w:rFonts w:asciiTheme="minorHAnsi" w:hAnsiTheme="minorHAnsi" w:cstheme="minorHAnsi"/>
         </w:rPr>
-        <w:t xml:space="preserve">Tabliczkę znamionową silnika napędzającego wentylator przedstawiono na rysunku 2.2, a odczytane z niej dane znamionowe zestawiono w tabeli 2.1.</w:t>
+        <w:t xml:space="preserve">Tabliczkę znamionową silnika napędzającego wentylator przedstawiono na rysunku 2.4, a odczytane z niej dane znamionowe zestawiono w tabeli 2.2.</w:t>
       </w:r>
     </w:p>
     <w:p>
@@ -2444,7 +3372,7 @@
           <wp:inline distT="0" distB="0" distL="0" distR="0">
             <wp:extent cx="3600000" cy="2700928"/>
             <wp:effectExtent l="0" t="0" r="4445" b="5715"/>
-            <wp:docPr id="102" name="Obraz 102"/>
+            <wp:docPr id="104" name="Obraz 104"/>
             <wp:cNvGraphicFramePr>
               <a:graphicFrameLocks xmlns:a="http://schemas.openxmlformats.org/drawingml/2006/main" noChangeAspect="1"/>
             </wp:cNvGraphicFramePr>
@@ -2456,7 +3384,7 @@
                     <pic:cNvPicPr/>
                   </pic:nvPicPr>
                   <pic:blipFill rotWithShape="1">
-                    <a:blip r:embed="rId15"/>
+                    <a:blip r:embed="rId17"/>
                     <a:stretch/>
                   </pic:blipFill>
                   <pic:spPr bwMode="auto">
@@ -2504,7 +3432,7 @@
           <w:sz w:val="22"/>
           <w:szCs w:val="22"/>
         </w:rPr>
-        <w:t xml:space="preserve">Rys. 2.2. Tabliczka znamionowa silnika napędzającego wentylator</w:t>
+        <w:t xml:space="preserve">Rys. 2.4. Tabliczka znamionowa silnika napędzającego wentylator</w:t>
       </w:r>
     </w:p>
     <w:p>
@@ -2545,7 +3473,7 @@
           <w:bCs w:val="0"/>
           <w:sz w:val="22"/>
         </w:rPr>
-        <w:t xml:space="preserve">Tab. 2.1. Dane znamionowe silnika napędzającego wentylator</w:t>
+        <w:t xml:space="preserve">Tab. 2.2. Dane znamionowe silnika napędzającego wentylator</w:t>
       </w:r>
     </w:p>
     <w:tbl>
@@ -3223,6 +4151,489 @@
         <w:rPr>
           <w:rFonts w:asciiTheme="minorHAnsi" w:hAnsiTheme="minorHAnsi" w:cstheme="minorHAnsi"/>
         </w:rPr>
+        <w:t xml:space="preserve">Badanie charakterystyki mechanicznej polegało na określeniu wartości momentu obciążającego silnik w funkcji poślizgu. Dla każdego ustawienia obciążenia – od momentu szczątkowego do maksymalnego możliwego do uzyskania – notowano wartość momentu oraz prędkości obrotowej. Pomiary wykonano dla dwóch zestawów parametrów zasilania ustalonych przez prowadzącego: przy napięciu zasilania równym 70 % oraz 55 % napięcia znamionowego U</w:t>
+      </w:r>
+      <w:r>
+        <w:rPr>
+          <w:rFonts w:asciiTheme="minorHAnsi" w:hAnsiTheme="minorHAnsi" w:cstheme="minorHAnsi"/>
+          <w:vertAlign w:val="subscript"/>
+        </w:rPr>
+        <w:t xml:space="preserve">N</w:t>
+      </w:r>
+      <w:r>
+        <w:rPr>
+          <w:rFonts w:asciiTheme="minorHAnsi" w:hAnsiTheme="minorHAnsi" w:cstheme="minorHAnsi"/>
+        </w:rPr>
+        <w:t xml:space="preserve">. Przy większych obciążeniach po każdym odczycie zmniejszano obciążenie w celu ograniczenia nagrzewania się rezystora. Z otrzymanych charakterystyk mechanicznych odczytano moment krytyczny M</w:t>
+      </w:r>
+      <w:r>
+        <w:rPr>
+          <w:rFonts w:asciiTheme="minorHAnsi" w:hAnsiTheme="minorHAnsi" w:cstheme="minorHAnsi"/>
+          <w:vertAlign w:val="subscript"/>
+        </w:rPr>
+        <w:t xml:space="preserve">k</w:t>
+      </w:r>
+      <w:r>
+        <w:rPr>
+          <w:rFonts w:asciiTheme="minorHAnsi" w:hAnsiTheme="minorHAnsi" w:cstheme="minorHAnsi"/>
+        </w:rPr>
+        <w:t xml:space="preserve"> i poślizg krytyczny s</w:t>
+      </w:r>
+      <w:r>
+        <w:rPr>
+          <w:rFonts w:asciiTheme="minorHAnsi" w:hAnsiTheme="minorHAnsi" w:cstheme="minorHAnsi"/>
+          <w:vertAlign w:val="subscript"/>
+        </w:rPr>
+        <w:t xml:space="preserve">k</w:t>
+      </w:r>
+      <w:r>
+        <w:rPr>
+          <w:rFonts w:asciiTheme="minorHAnsi" w:hAnsiTheme="minorHAnsi" w:cstheme="minorHAnsi"/>
+        </w:rPr>
+        <w:t xml:space="preserve">, które zestawiono w tabeli 3.1.</w:t>
+      </w:r>
+    </w:p>
+    <w:p>
+      <w:pPr>
+        <w:ind w:firstLine="284"/>
+        <w:jc w:val="both"/>
+        <w:rPr>
+          <w:rFonts w:asciiTheme="minorHAnsi" w:hAnsiTheme="minorHAnsi" w:cstheme="minorHAnsi"/>
+        </w:rPr>
+      </w:pPr>
+    </w:p>
+    <w:p>
+      <w:pPr>
+        <w:pStyle w:val="Tabela"/>
+        <w:spacing w:before="0" w:line="240" w:lineRule="auto"/>
+        <w:ind w:left="709"/>
+        <w:jc w:val="left"/>
+        <w:rPr>
+          <w:rFonts w:asciiTheme="minorHAnsi" w:hAnsiTheme="minorHAnsi" w:cstheme="minorHAnsi"/>
+          <w:b w:val="0"/>
+          <w:bCs w:val="0"/>
+          <w:sz w:val="22"/>
+        </w:rPr>
+      </w:pPr>
+      <w:r>
+        <w:rPr>
+          <w:rFonts w:asciiTheme="minorHAnsi" w:hAnsiTheme="minorHAnsi" w:cstheme="minorHAnsi"/>
+          <w:b w:val="0"/>
+          <w:bCs w:val="0"/>
+          <w:sz w:val="22"/>
+        </w:rPr>
+        <w:t xml:space="preserve">Tab. 3.1. Parametry krytyczne odczytane z charakterystyk mechanicznych silnika</w:t>
+      </w:r>
+    </w:p>
+    <w:tbl>
+      <w:tblPr>
+        <w:tblW w:w="0" w:type="auto"/>
+        <w:jc w:val="center"/>
+        <w:tblBorders>
+          <w:top w:val="single" w:sz="6" w:space="0" w:color="000000"/>
+          <w:left w:val="single" w:sz="6" w:space="0" w:color="000000"/>
+          <w:bottom w:val="single" w:sz="6" w:space="0" w:color="000000"/>
+          <w:right w:val="single" w:sz="6" w:space="0" w:color="000000"/>
+          <w:insideH w:val="single" w:sz="6" w:space="0" w:color="000000"/>
+          <w:insideV w:val="single" w:sz="6" w:space="0" w:color="000000"/>
+        </w:tblBorders>
+        <w:tblLayout w:type="fixed"/>
+        <w:tblLook w:val="0000" w:firstRow="0" w:lastRow="0" w:firstColumn="0" w:lastColumn="0" w:noHBand="0" w:noVBand="0"/>
+      </w:tblPr>
+      <w:tblGrid>
+        <w:gridCol w:w="737"/>
+        <w:gridCol w:w="1927"/>
+        <w:gridCol w:w="1701"/>
+        <w:gridCol w:w="1701"/>
+      </w:tblGrid>
+      <w:tr>
+        <w:trPr>
+          <w:cantSplit/>
+          <w:trHeight w:hRule="exact" w:val="370"/>
+          <w:jc w:val="center"/>
+          <w:tblHeader/>
+        </w:trPr>
+        <w:tc>
+          <w:tcPr>
+            <w:tcW w:w="737" w:type="dxa"/>
+            <w:vAlign w:val="center"/>
+          </w:tcPr>
+          <w:p>
+            <w:pPr>
+              <w:pStyle w:val="Tabela-wntrze"/>
+              <w:keepNext/>
+              <w:spacing w:before="0" w:after="0"/>
+              <w:rPr>
+                <w:rFonts w:asciiTheme="minorHAnsi" w:hAnsiTheme="minorHAnsi" w:cstheme="minorHAnsi"/>
+                <w:sz w:val="22"/>
+              </w:rPr>
+            </w:pPr>
+            <w:r>
+              <w:rPr>
+                <w:rFonts w:asciiTheme="minorHAnsi" w:hAnsiTheme="minorHAnsi" w:cstheme="minorHAnsi"/>
+                <w:sz w:val="22"/>
+              </w:rPr>
+              <w:t xml:space="preserve">L.p.</w:t>
+            </w:r>
+          </w:p>
+        </w:tc>
+        <w:tc>
+          <w:tcPr>
+            <w:tcW w:w="1927" w:type="dxa"/>
+            <w:vAlign w:val="center"/>
+          </w:tcPr>
+          <w:p>
+            <w:pPr>
+              <w:pStyle w:val="Tabela-wntrze"/>
+              <w:keepNext/>
+              <w:spacing w:before="0" w:after="0"/>
+              <w:rPr>
+                <w:rFonts w:asciiTheme="minorHAnsi" w:hAnsiTheme="minorHAnsi" w:cstheme="minorHAnsi"/>
+                <w:sz w:val="22"/>
+              </w:rPr>
+            </w:pPr>
+            <w:r>
+              <w:rPr>
+                <w:rFonts w:asciiTheme="minorHAnsi" w:hAnsiTheme="minorHAnsi" w:cstheme="minorHAnsi"/>
+                <w:sz w:val="22"/>
+              </w:rPr>
+              <w:t xml:space="preserve">U</w:t>
+            </w:r>
+            <w:r>
+              <w:rPr>
+                <w:rFonts w:asciiTheme="minorHAnsi" w:hAnsiTheme="minorHAnsi" w:cstheme="minorHAnsi"/>
+                <w:sz w:val="22"/>
+                <w:vertAlign w:val="subscript"/>
+              </w:rPr>
+              <w:t xml:space="preserve">zas</w:t>
+            </w:r>
+            <w:r>
+              <w:rPr>
+                <w:rFonts w:asciiTheme="minorHAnsi" w:hAnsiTheme="minorHAnsi" w:cstheme="minorHAnsi"/>
+                <w:sz w:val="22"/>
+              </w:rPr>
+              <w:t xml:space="preserve"> [% U</w:t>
+            </w:r>
+            <w:r>
+              <w:rPr>
+                <w:rFonts w:asciiTheme="minorHAnsi" w:hAnsiTheme="minorHAnsi" w:cstheme="minorHAnsi"/>
+                <w:sz w:val="22"/>
+                <w:vertAlign w:val="subscript"/>
+              </w:rPr>
+              <w:t xml:space="preserve">N</w:t>
+            </w:r>
+            <w:r>
+              <w:rPr>
+                <w:rFonts w:asciiTheme="minorHAnsi" w:hAnsiTheme="minorHAnsi" w:cstheme="minorHAnsi"/>
+                <w:sz w:val="22"/>
+              </w:rPr>
+              <w:t xml:space="preserve">]</w:t>
+            </w:r>
+          </w:p>
+        </w:tc>
+        <w:tc>
+          <w:tcPr>
+            <w:tcW w:w="1701" w:type="dxa"/>
+            <w:vAlign w:val="center"/>
+          </w:tcPr>
+          <w:p>
+            <w:pPr>
+              <w:pStyle w:val="Tabela-wntrze"/>
+              <w:keepNext/>
+              <w:spacing w:before="0" w:after="0"/>
+              <w:rPr>
+                <w:rFonts w:asciiTheme="minorHAnsi" w:hAnsiTheme="minorHAnsi" w:cstheme="minorHAnsi"/>
+                <w:sz w:val="22"/>
+              </w:rPr>
+            </w:pPr>
+            <w:r>
+              <w:rPr>
+                <w:rFonts w:asciiTheme="minorHAnsi" w:hAnsiTheme="minorHAnsi" w:cstheme="minorHAnsi"/>
+                <w:sz w:val="22"/>
+              </w:rPr>
+              <w:t xml:space="preserve">M</w:t>
+            </w:r>
+            <w:r>
+              <w:rPr>
+                <w:rFonts w:asciiTheme="minorHAnsi" w:hAnsiTheme="minorHAnsi" w:cstheme="minorHAnsi"/>
+                <w:sz w:val="22"/>
+                <w:vertAlign w:val="subscript"/>
+              </w:rPr>
+              <w:t xml:space="preserve">k</w:t>
+            </w:r>
+            <w:r>
+              <w:rPr>
+                <w:rFonts w:asciiTheme="minorHAnsi" w:hAnsiTheme="minorHAnsi" w:cstheme="minorHAnsi"/>
+                <w:sz w:val="22"/>
+              </w:rPr>
+              <w:t xml:space="preserve"> [N·m]</w:t>
+            </w:r>
+          </w:p>
+        </w:tc>
+        <w:tc>
+          <w:tcPr>
+            <w:tcW w:w="1701" w:type="dxa"/>
+            <w:vAlign w:val="center"/>
+          </w:tcPr>
+          <w:p>
+            <w:pPr>
+              <w:pStyle w:val="Tabela-wntrze"/>
+              <w:keepNext/>
+              <w:spacing w:before="0" w:after="0"/>
+              <w:rPr>
+                <w:rFonts w:asciiTheme="minorHAnsi" w:hAnsiTheme="minorHAnsi" w:cstheme="minorHAnsi"/>
+                <w:sz w:val="22"/>
+              </w:rPr>
+            </w:pPr>
+            <w:r>
+              <w:rPr>
+                <w:rFonts w:asciiTheme="minorHAnsi" w:hAnsiTheme="minorHAnsi" w:cstheme="minorHAnsi"/>
+                <w:sz w:val="22"/>
+              </w:rPr>
+              <w:t xml:space="preserve">s</w:t>
+            </w:r>
+            <w:r>
+              <w:rPr>
+                <w:rFonts w:asciiTheme="minorHAnsi" w:hAnsiTheme="minorHAnsi" w:cstheme="minorHAnsi"/>
+                <w:sz w:val="22"/>
+                <w:vertAlign w:val="subscript"/>
+              </w:rPr>
+              <w:t xml:space="preserve">k</w:t>
+            </w:r>
+            <w:r>
+              <w:rPr>
+                <w:rFonts w:asciiTheme="minorHAnsi" w:hAnsiTheme="minorHAnsi" w:cstheme="minorHAnsi"/>
+                <w:sz w:val="22"/>
+              </w:rPr>
+              <w:t xml:space="preserve"> [-]</w:t>
+            </w:r>
+          </w:p>
+        </w:tc>
+      </w:tr>
+      <w:tr>
+        <w:trPr>
+          <w:cantSplit/>
+          <w:trHeight w:hRule="exact" w:val="370"/>
+          <w:jc w:val="center"/>
+        </w:trPr>
+        <w:tc>
+          <w:tcPr>
+            <w:tcW w:w="737" w:type="dxa"/>
+            <w:vAlign w:val="center"/>
+          </w:tcPr>
+          <w:p>
+            <w:pPr>
+              <w:pStyle w:val="Tabela-wntrze"/>
+              <w:keepNext/>
+              <w:spacing w:before="0" w:after="0"/>
+              <w:rPr>
+                <w:rFonts w:asciiTheme="minorHAnsi" w:hAnsiTheme="minorHAnsi" w:cstheme="minorHAnsi"/>
+                <w:sz w:val="22"/>
+              </w:rPr>
+            </w:pPr>
+            <w:r>
+              <w:rPr>
+                <w:rFonts w:asciiTheme="minorHAnsi" w:hAnsiTheme="minorHAnsi" w:cstheme="minorHAnsi"/>
+                <w:sz w:val="22"/>
+              </w:rPr>
+              <w:t xml:space="preserve">1</w:t>
+            </w:r>
+          </w:p>
+        </w:tc>
+        <w:tc>
+          <w:tcPr>
+            <w:tcW w:w="1927" w:type="dxa"/>
+            <w:vAlign w:val="center"/>
+          </w:tcPr>
+          <w:p>
+            <w:pPr>
+              <w:pStyle w:val="Tabela-wntrze"/>
+              <w:keepNext/>
+              <w:spacing w:before="0" w:after="0"/>
+              <w:rPr>
+                <w:rFonts w:asciiTheme="minorHAnsi" w:hAnsiTheme="minorHAnsi" w:cstheme="minorHAnsi"/>
+                <w:sz w:val="22"/>
+              </w:rPr>
+            </w:pPr>
+            <w:r>
+              <w:rPr>
+                <w:rFonts w:asciiTheme="minorHAnsi" w:hAnsiTheme="minorHAnsi" w:cstheme="minorHAnsi"/>
+                <w:sz w:val="22"/>
+              </w:rPr>
+              <w:t xml:space="preserve">70 %</w:t>
+            </w:r>
+          </w:p>
+        </w:tc>
+        <w:tc>
+          <w:tcPr>
+            <w:tcW w:w="1701" w:type="dxa"/>
+            <w:vAlign w:val="center"/>
+          </w:tcPr>
+          <w:p>
+            <w:pPr>
+              <w:pStyle w:val="Tabela-wntrze"/>
+              <w:keepNext/>
+              <w:spacing w:before="0" w:after="0"/>
+              <w:rPr>
+                <w:rFonts w:asciiTheme="minorHAnsi" w:hAnsiTheme="minorHAnsi" w:cstheme="minorHAnsi"/>
+                <w:sz w:val="22"/>
+              </w:rPr>
+            </w:pPr>
+            <w:r>
+              <w:rPr>
+                <w:rFonts w:asciiTheme="minorHAnsi" w:hAnsiTheme="minorHAnsi" w:cstheme="minorHAnsi"/>
+                <w:sz w:val="22"/>
+              </w:rPr>
+              <w:t xml:space="preserve">0,71</w:t>
+            </w:r>
+          </w:p>
+        </w:tc>
+        <w:tc>
+          <w:tcPr>
+            <w:tcW w:w="1701" w:type="dxa"/>
+            <w:vAlign w:val="center"/>
+          </w:tcPr>
+          <w:p>
+            <w:pPr>
+              <w:pStyle w:val="Tabela-wntrze"/>
+              <w:keepNext/>
+              <w:spacing w:before="0" w:after="0"/>
+              <w:rPr>
+                <w:rFonts w:asciiTheme="minorHAnsi" w:hAnsiTheme="minorHAnsi" w:cstheme="minorHAnsi"/>
+                <w:sz w:val="22"/>
+              </w:rPr>
+            </w:pPr>
+            <w:r>
+              <w:rPr>
+                <w:rFonts w:asciiTheme="minorHAnsi" w:hAnsiTheme="minorHAnsi" w:cstheme="minorHAnsi"/>
+                <w:sz w:val="22"/>
+              </w:rPr>
+              <w:t xml:space="preserve">0,63</w:t>
+            </w:r>
+          </w:p>
+        </w:tc>
+      </w:tr>
+      <w:tr>
+        <w:trPr>
+          <w:cantSplit/>
+          <w:trHeight w:hRule="exact" w:val="370"/>
+          <w:jc w:val="center"/>
+        </w:trPr>
+        <w:tc>
+          <w:tcPr>
+            <w:tcW w:w="737" w:type="dxa"/>
+            <w:vAlign w:val="center"/>
+          </w:tcPr>
+          <w:p>
+            <w:pPr>
+              <w:pStyle w:val="Tabela-wntrze"/>
+              <w:spacing w:before="0" w:after="0"/>
+              <w:rPr>
+                <w:rFonts w:asciiTheme="minorHAnsi" w:hAnsiTheme="minorHAnsi" w:cstheme="minorHAnsi"/>
+                <w:sz w:val="22"/>
+              </w:rPr>
+            </w:pPr>
+            <w:r>
+              <w:rPr>
+                <w:rFonts w:asciiTheme="minorHAnsi" w:hAnsiTheme="minorHAnsi" w:cstheme="minorHAnsi"/>
+                <w:sz w:val="22"/>
+              </w:rPr>
+              <w:t xml:space="preserve">2</w:t>
+            </w:r>
+          </w:p>
+        </w:tc>
+        <w:tc>
+          <w:tcPr>
+            <w:tcW w:w="1927" w:type="dxa"/>
+            <w:vAlign w:val="center"/>
+          </w:tcPr>
+          <w:p>
+            <w:pPr>
+              <w:pStyle w:val="Tabela-wntrze"/>
+              <w:spacing w:before="0" w:after="0"/>
+              <w:rPr>
+                <w:rFonts w:asciiTheme="minorHAnsi" w:hAnsiTheme="minorHAnsi" w:cstheme="minorHAnsi"/>
+                <w:sz w:val="22"/>
+              </w:rPr>
+            </w:pPr>
+            <w:r>
+              <w:rPr>
+                <w:rFonts w:asciiTheme="minorHAnsi" w:hAnsiTheme="minorHAnsi" w:cstheme="minorHAnsi"/>
+                <w:sz w:val="22"/>
+              </w:rPr>
+              <w:t xml:space="preserve">55 %</w:t>
+            </w:r>
+          </w:p>
+        </w:tc>
+        <w:tc>
+          <w:tcPr>
+            <w:tcW w:w="1701" w:type="dxa"/>
+            <w:vAlign w:val="center"/>
+          </w:tcPr>
+          <w:p>
+            <w:pPr>
+              <w:pStyle w:val="Tabela-wntrze"/>
+              <w:spacing w:before="0" w:after="0"/>
+              <w:rPr>
+                <w:rFonts w:asciiTheme="minorHAnsi" w:hAnsiTheme="minorHAnsi" w:cstheme="minorHAnsi"/>
+                <w:sz w:val="22"/>
+              </w:rPr>
+            </w:pPr>
+            <w:r>
+              <w:rPr>
+                <w:rFonts w:asciiTheme="minorHAnsi" w:hAnsiTheme="minorHAnsi" w:cstheme="minorHAnsi"/>
+                <w:sz w:val="22"/>
+              </w:rPr>
+              <w:t xml:space="preserve">0,47</w:t>
+            </w:r>
+          </w:p>
+        </w:tc>
+        <w:tc>
+          <w:tcPr>
+            <w:tcW w:w="1701" w:type="dxa"/>
+            <w:vAlign w:val="center"/>
+          </w:tcPr>
+          <w:p>
+            <w:pPr>
+              <w:pStyle w:val="Tabela-wntrze"/>
+              <w:spacing w:before="0" w:after="0"/>
+              <w:rPr>
+                <w:rFonts w:asciiTheme="minorHAnsi" w:hAnsiTheme="minorHAnsi" w:cstheme="minorHAnsi"/>
+                <w:sz w:val="22"/>
+              </w:rPr>
+            </w:pPr>
+            <w:r>
+              <w:rPr>
+                <w:rFonts w:asciiTheme="minorHAnsi" w:hAnsiTheme="minorHAnsi" w:cstheme="minorHAnsi"/>
+                <w:sz w:val="22"/>
+              </w:rPr>
+              <w:t xml:space="preserve">0,61</w:t>
+            </w:r>
+          </w:p>
+        </w:tc>
+      </w:tr>
+    </w:tbl>
+    <w:p>
+      <w:pPr>
+        <w:ind w:firstLine="284"/>
+        <w:jc w:val="both"/>
+        <w:rPr>
+          <w:rFonts w:asciiTheme="minorHAnsi" w:hAnsiTheme="minorHAnsi" w:cstheme="minorHAnsi"/>
+        </w:rPr>
+      </w:pPr>
+    </w:p>
+    <w:p>
+      <w:pPr>
+        <w:ind w:firstLine="284"/>
+        <w:jc w:val="both"/>
+        <w:rPr>
+          <w:rFonts w:asciiTheme="minorHAnsi" w:hAnsiTheme="minorHAnsi" w:cstheme="minorHAnsi"/>
+        </w:rPr>
+      </w:pPr>
+      <w:r>
+        <w:rPr>
+          <w:rFonts w:asciiTheme="minorHAnsi" w:hAnsiTheme="minorHAnsi" w:cstheme="minorHAnsi"/>
+        </w:rPr>
         <w:t xml:space="preserve">Pomiar prądu rozruchowego polegał na rejestracji wartości skutecznych prądów w trzech fazach zasilania od chwili załączenia silnika, przez okres pracy ustalonej, aż do jego wyłączenia. Pomiar wykonano trzykrotnie w dniu 08.10.2026 w godzinach 13:48:27–13:52:21. Pełny zarejestrowany przebieg przedstawiono na rysunku 3.1 – widoczne są na nim trzy rozruchy silnika, oddzielone okresami, w których silnik był wyłączony (prąd równy zeru).</w:t>
       </w:r>
     </w:p>
@@ -3250,7 +4661,7 @@
           <wp:inline distT="0" distB="0" distL="0" distR="0">
             <wp:extent cx="5580000" cy="2657142"/>
             <wp:effectExtent l="0" t="0" r="4445" b="5715"/>
-            <wp:docPr id="103" name="Obraz 103"/>
+            <wp:docPr id="105" name="Obraz 105"/>
             <wp:cNvGraphicFramePr>
               <a:graphicFrameLocks xmlns:a="http://schemas.openxmlformats.org/drawingml/2006/main" noChangeAspect="1"/>
             </wp:cNvGraphicFramePr>
@@ -3262,7 +4673,7 @@
                     <pic:cNvPicPr/>
                   </pic:nvPicPr>
                   <pic:blipFill rotWithShape="1">
-                    <a:blip r:embed="rId16"/>
+                    <a:blip r:embed="rId18"/>
                     <a:stretch/>
                   </pic:blipFill>
                   <pic:spPr bwMode="auto">
@@ -3334,7 +4745,7 @@
         <w:rPr>
           <w:rFonts w:asciiTheme="minorHAnsi" w:hAnsiTheme="minorHAnsi" w:cstheme="minorHAnsi"/>
         </w:rPr>
-        <w:t xml:space="preserve">W tabelach 3.1–3.3 zestawiono wartości prądów zarejestrowane w czasie trwania poszczególnych rozruchów (pominięto próbki zerowe, gdy silnik był wyłączony). Czas t liczony jest od chwili załączenia silnika, tj. od pierwszej niezerowej próbki.</w:t>
+        <w:t xml:space="preserve">W tabelach 3.2–3.4 zestawiono wartości prądów zarejestrowane w czasie trwania poszczególnych rozruchów (pominięto próbki zerowe, gdy silnik był wyłączony). Czas t liczony jest od chwili załączenia silnika, tj. od pierwszej niezerowej próbki.</w:t>
       </w:r>
     </w:p>
     <w:p>
@@ -3366,7 +4777,7 @@
           <w:bCs w:val="0"/>
           <w:sz w:val="22"/>
         </w:rPr>
-        <w:t xml:space="preserve">Tab. 3.1. Wartości skuteczne prądów fazowych zarejestrowane podczas pomiaru 1</w:t>
+        <w:t xml:space="preserve">Tab. 3.2. Wartości skuteczne prądów fazowych zarejestrowane podczas pomiaru 1</w:t>
       </w:r>
     </w:p>
     <w:tbl>
@@ -5585,7 +6996,7 @@
           <w:bCs w:val="0"/>
           <w:sz w:val="22"/>
         </w:rPr>
-        <w:t xml:space="preserve">Tab. 3.2. Wartości skuteczne prądów fazowych zarejestrowane podczas pomiaru 2</w:t>
+        <w:t xml:space="preserve">Tab. 3.3. Wartości skuteczne prądów fazowych zarejestrowane podczas pomiaru 2</w:t>
       </w:r>
     </w:p>
     <w:tbl>
@@ -8106,7 +9517,7 @@
           <w:bCs w:val="0"/>
           <w:sz w:val="22"/>
         </w:rPr>
-        <w:t xml:space="preserve">Tab. 3.3. Wartości skuteczne prądów fazowych zarejestrowane podczas pomiaru 3</w:t>
+        <w:t xml:space="preserve">Tab. 3.4. Wartości skuteczne prądów fazowych zarejestrowane podczas pomiaru 3</w:t>
       </w:r>
     </w:p>
     <w:tbl>
@@ -10157,7 +11568,7 @@
         <w:rPr>
           <w:rFonts w:asciiTheme="minorHAnsi" w:hAnsiTheme="minorHAnsi" w:cstheme="minorHAnsi"/>
         </w:rPr>
-        <w:t xml:space="preserve">Na rysunkach 3.2–3.4 przedstawiono przebiegi prądów fazowych w funkcji czasu dla każdego z pomiarów (trzy fazy na jednym wykresie). Kolorem czerwonym zaznaczono zakres, z którego odczytano maksymalne wartości prądu podczas rozruchu (wartości maksymalne każdej z faz wyróżniono rombami), a kolorem zielonym – zakres stanu ustalonego, z którego obliczono średnią wartość prądu pracy ustalonej. Do stanu ustalonego zaliczono próbki, w których prąd każdej fazy różnił się o nie więcej niż 10 % od mediany danego rozruchu; pominięto próbki z okresu narastania prędkości oraz z chwili wyłączania silnika.</w:t>
+        <w:t xml:space="preserve">Maksymalną wartość prądu każdej fazy podczas rozruchu odczytano z dwóch pierwszych próbek po załączeniu silnika. Do zakresu stanu ustalonego zaliczono próbki, w których prąd każdej fazy różnił się o nie więcej niż 10 % od mediany danego rozruchu – pominięto próbki z okresu narastania prędkości oraz z chwili wyłączania silnika. Przyjęte zakresy stanu ustalonego podano w tabeli 4.2.</w:t>
       </w:r>
     </w:p>
     <w:p>
@@ -10168,85 +11579,1018 @@
           <w:rFonts w:asciiTheme="minorHAnsi" w:hAnsiTheme="minorHAnsi" w:cstheme="minorHAnsi"/>
         </w:rPr>
       </w:pPr>
+      <w:r>
+        <w:rPr>
+          <w:rFonts w:asciiTheme="minorHAnsi" w:hAnsiTheme="minorHAnsi" w:cstheme="minorHAnsi"/>
+        </w:rPr>
+        <w:t xml:space="preserve">We wszystkich pomiarach prąd osiąga wartość maksymalną w ciągu pierwszych 1–2 s po załączeniu, a następnie szybko maleje do wartości ustalonej ok. 0,99 A. Najwyższe maksimum prądu zarejestrowano w pomiarze 1 (3,705 A), a najniższe – w pomiarze 2 (2,823 A). W pomiarze 2 maksimum fazy L1 zarejestrowano o jedną próbkę później niż w fazach L2 i L3, a w pomiarach 2 i 3 pierwsza niezerowa próbka ma wartość mniejszą niż druga. Wynika to z faktu, że miernik uśrednia wartość skuteczną w oknie 1 s, a chwila załączenia przypada w różnych miejscach tego okna – krótkotrwały impuls prądu rozruchowego jest więc „rozmywany” na jedną lub dwie próbki.</w:t>
+      </w:r>
     </w:p>
     <w:p>
       <w:pPr>
-        <w:keepNext/>
-        <w:jc w:val="center"/>
+        <w:ind w:firstLine="284"/>
+        <w:jc w:val="both"/>
+        <w:rPr>
+          <w:rFonts w:asciiTheme="minorHAnsi" w:hAnsiTheme="minorHAnsi" w:cstheme="minorHAnsi"/>
+        </w:rPr>
       </w:pPr>
-      <w:r>
-        <w:rPr>
-          <w:rFonts w:asciiTheme="minorHAnsi" w:hAnsiTheme="minorHAnsi" w:cstheme="minorHAnsi"/>
-          <w:noProof/>
-          <w:snapToGrid/>
-        </w:rPr>
-        <w:drawing>
-          <wp:inline distT="0" distB="0" distL="0" distR="0">
-            <wp:extent cx="5580000" cy="2834285"/>
-            <wp:effectExtent l="0" t="0" r="4445" b="5715"/>
-            <wp:docPr id="104" name="Obraz 104"/>
-            <wp:cNvGraphicFramePr>
-              <a:graphicFrameLocks xmlns:a="http://schemas.openxmlformats.org/drawingml/2006/main" noChangeAspect="1"/>
-            </wp:cNvGraphicFramePr>
-            <a:graphic xmlns:a="http://schemas.openxmlformats.org/drawingml/2006/main">
-              <a:graphicData uri="http://schemas.openxmlformats.org/drawingml/2006/picture">
-                <pic:pic xmlns:pic="http://schemas.openxmlformats.org/drawingml/2006/picture">
-                  <pic:nvPicPr>
-                    <pic:cNvPr id="1" name=""/>
-                    <pic:cNvPicPr/>
-                  </pic:nvPicPr>
-                  <pic:blipFill rotWithShape="1">
-                    <a:blip r:embed="rId17"/>
-                    <a:stretch/>
-                  </pic:blipFill>
-                  <pic:spPr bwMode="auto">
-                    <a:xfrm>
-                      <a:off x="0" y="0"/>
-                      <a:ext cx="5580000" cy="2834285"/>
-                    </a:xfrm>
-                    <a:prstGeom prst="rect">
-                      <a:avLst/>
-                    </a:prstGeom>
-                    <a:ln>
-                      <a:noFill/>
-                    </a:ln>
-                    <a:extLst>
-                      <a:ext uri="{53640926-AAD7-44D8-BBD7-CCE9431645EC}">
-                        <a14:shadowObscured xmlns:a14="http://schemas.microsoft.com/office/drawing/2010/main"/>
-                      </a:ext>
-                    </a:extLst>
-                  </pic:spPr>
-                </pic:pic>
-              </a:graphicData>
-            </a:graphic>
-          </wp:inline>
-        </w:drawing>
-      </w:r>
     </w:p>
     <w:p>
       <w:pPr>
-        <w:pStyle w:val="Legenda"/>
-        <w:spacing w:after="0"/>
+        <w:pStyle w:val="Nagwek1"/>
+        <w:rPr>
+          <w:sz w:val="28"/>
+        </w:rPr>
+      </w:pPr>
+      <w:r>
+        <w:rPr>
+          <w:sz w:val="28"/>
+        </w:rPr>
+        <w:t xml:space="preserve">Wyniki obliczeń</w:t>
+      </w:r>
+    </w:p>
+    <w:p>
+      <w:pPr>
+        <w:ind w:firstLine="284"/>
+        <w:jc w:val="both"/>
+        <w:rPr>
+          <w:rFonts w:asciiTheme="minorHAnsi" w:hAnsiTheme="minorHAnsi" w:cstheme="minorHAnsi"/>
+        </w:rPr>
+      </w:pPr>
+      <w:r>
+        <w:rPr>
+          <w:rFonts w:asciiTheme="minorHAnsi" w:hAnsiTheme="minorHAnsi" w:cstheme="minorHAnsi"/>
+        </w:rPr>
+        <w:t xml:space="preserve">Prędkość synchroniczną badanego silnika (pro-MOTOR MS 71 1-4) obliczono ze wzoru:</w:t>
+      </w:r>
+    </w:p>
+    <w:p>
+      <w:pPr>
+        <w:ind w:firstLine="284"/>
+        <w:jc w:val="both"/>
+        <w:rPr>
+          <w:rFonts w:asciiTheme="minorHAnsi" w:hAnsiTheme="minorHAnsi" w:cstheme="minorHAnsi"/>
+        </w:rPr>
+      </w:pPr>
+    </w:p>
+    <w:p>
+      <w:pPr>
+        <w:jc w:val="right"/>
+        <w:rPr>
+          <w:rFonts w:asciiTheme="minorHAnsi" w:hAnsiTheme="minorHAnsi" w:cstheme="minorHAnsi"/>
+        </w:rPr>
+      </w:pPr>
+      <m:oMath>
+        <m:sSub>
+          <m:e>
+            <m:r>
+              <w:rPr>
+                <w:rFonts w:ascii="Cambria Math" w:hAnsi="Cambria Math"/>
+              </w:rPr>
+              <m:t xml:space="preserve">n</m:t>
+            </m:r>
+          </m:e>
+          <m:sub>
+            <m:r>
+              <m:rPr>
+                <m:sty m:val="p"/>
+              </m:rPr>
+              <w:rPr>
+                <w:rFonts w:ascii="Cambria Math" w:hAnsi="Cambria Math"/>
+              </w:rPr>
+              <m:t xml:space="preserve">s</m:t>
+            </m:r>
+          </m:sub>
+        </m:sSub>
+        <m:r>
+          <w:rPr>
+            <w:rFonts w:ascii="Cambria Math" w:hAnsi="Cambria Math"/>
+          </w:rPr>
+          <m:t xml:space="preserve">=</m:t>
+        </m:r>
+        <m:f>
+          <m:num>
+            <m:r>
+              <w:rPr>
+                <w:rFonts w:ascii="Cambria Math" w:hAnsi="Cambria Math"/>
+              </w:rPr>
+              <m:t xml:space="preserve">60∙</m:t>
+            </m:r>
+            <m:sSub>
+              <m:e>
+                <m:r>
+                  <w:rPr>
+                    <w:rFonts w:ascii="Cambria Math" w:hAnsi="Cambria Math"/>
+                  </w:rPr>
+                  <m:t xml:space="preserve">f</m:t>
+                </m:r>
+              </m:e>
+              <m:sub>
+                <m:r>
+                  <m:rPr>
+                    <m:sty m:val="p"/>
+                  </m:rPr>
+                  <w:rPr>
+                    <w:rFonts w:ascii="Cambria Math" w:hAnsi="Cambria Math"/>
+                  </w:rPr>
+                  <m:t xml:space="preserve">1</m:t>
+                </m:r>
+              </m:sub>
+            </m:sSub>
+          </m:num>
+          <m:den>
+            <m:r>
+              <w:rPr>
+                <w:rFonts w:ascii="Cambria Math" w:hAnsi="Cambria Math"/>
+              </w:rPr>
+              <m:t xml:space="preserve">p</m:t>
+            </m:r>
+          </m:den>
+        </m:f>
+        <m:r>
+          <w:rPr>
+            <w:rFonts w:ascii="Cambria Math" w:hAnsi="Cambria Math"/>
+          </w:rPr>
+          <m:t xml:space="preserve">=</m:t>
+        </m:r>
+        <m:f>
+          <m:num>
+            <m:r>
+              <w:rPr>
+                <w:rFonts w:ascii="Cambria Math" w:hAnsi="Cambria Math"/>
+              </w:rPr>
+              <m:t xml:space="preserve">60∙50</m:t>
+            </m:r>
+          </m:num>
+          <m:den>
+            <m:r>
+              <w:rPr>
+                <w:rFonts w:ascii="Cambria Math" w:hAnsi="Cambria Math"/>
+              </w:rPr>
+              <m:t xml:space="preserve">2</m:t>
+            </m:r>
+          </m:den>
+        </m:f>
+        <m:r>
+          <w:rPr>
+            <w:rFonts w:ascii="Cambria Math" w:hAnsi="Cambria Math"/>
+          </w:rPr>
+          <m:t xml:space="preserve">=1500</m:t>
+        </m:r>
+        <m:r>
+          <m:rPr>
+            <m:nor/>
+          </m:rPr>
+          <w:rPr>
+            <w:rFonts w:ascii="Cambria Math" w:hAnsi="Cambria Math"/>
+          </w:rPr>
+          <m:t xml:space="preserve"> obr/min</m:t>
+        </m:r>
+      </m:oMath>
+      <w:r>
+        <w:rPr>
+          <w:rFonts w:asciiTheme="minorHAnsi" w:hAnsiTheme="minorHAnsi" w:cstheme="minorHAnsi"/>
+        </w:rPr>
+        <w:t xml:space="preserve"> </w:t>
+      </w:r>
+      <w:r>
+        <w:rPr>
+          <w:rFonts w:asciiTheme="minorHAnsi" w:hAnsiTheme="minorHAnsi" w:cstheme="minorHAnsi"/>
+        </w:rPr>
+        <w:tab/>
+      </w:r>
+      <w:r>
+        <w:rPr>
+          <w:rFonts w:asciiTheme="minorHAnsi" w:hAnsiTheme="minorHAnsi" w:cstheme="minorHAnsi"/>
+        </w:rPr>
+        <w:tab/>
+      </w:r>
+      <w:r>
+        <w:rPr>
+          <w:rFonts w:asciiTheme="minorHAnsi" w:hAnsiTheme="minorHAnsi" w:cstheme="minorHAnsi"/>
+        </w:rPr>
+        <w:tab/>
+      </w:r>
+      <w:r>
+        <w:rPr>
+          <w:rFonts w:asciiTheme="minorHAnsi" w:hAnsiTheme="minorHAnsi" w:cstheme="minorHAnsi"/>
+        </w:rPr>
+        <w:tab/>
+      </w:r>
+      <w:r>
+        <w:rPr>
+          <w:rFonts w:asciiTheme="minorHAnsi" w:hAnsiTheme="minorHAnsi" w:cstheme="minorHAnsi"/>
+        </w:rPr>
+        <w:tab/>
+      </w:r>
+      <w:r>
+        <w:rPr>
+          <w:rFonts w:asciiTheme="minorHAnsi" w:hAnsiTheme="minorHAnsi" w:cstheme="minorHAnsi"/>
+        </w:rPr>
+        <w:t>(1)</w:t>
+      </w:r>
+    </w:p>
+    <w:p>
+      <w:pPr>
+        <w:rPr>
+          <w:rFonts w:asciiTheme="minorHAnsi" w:hAnsiTheme="minorHAnsi" w:cstheme="minorHAnsi"/>
+        </w:rPr>
+      </w:pPr>
+      <w:r>
+        <w:rPr>
+          <w:rFonts w:asciiTheme="minorHAnsi" w:hAnsiTheme="minorHAnsi" w:cstheme="minorHAnsi"/>
+        </w:rPr>
+        <w:t>gdzie:</w:t>
+      </w:r>
+    </w:p>
+    <w:p>
+      <w:pPr>
+        <w:ind w:firstLine="284"/>
+        <w:jc w:val="both"/>
+        <w:rPr>
+          <w:rFonts w:asciiTheme="minorHAnsi" w:hAnsiTheme="minorHAnsi" w:cstheme="minorHAnsi"/>
+        </w:rPr>
+      </w:pPr>
+      <w:r>
+        <w:rPr>
+          <w:rFonts w:asciiTheme="minorHAnsi" w:hAnsiTheme="minorHAnsi" w:cstheme="minorHAnsi"/>
+          <w:i/>
+        </w:rPr>
+        <w:t xml:space="preserve">f</w:t>
+      </w:r>
+      <w:r>
+        <w:rPr>
+          <w:rFonts w:asciiTheme="minorHAnsi" w:hAnsiTheme="minorHAnsi" w:cstheme="minorHAnsi"/>
+          <w:i/>
+          <w:vertAlign w:val="subscript"/>
+        </w:rPr>
+        <w:t xml:space="preserve">1</w:t>
+      </w:r>
+      <w:r>
+        <w:rPr>
+          <w:rFonts w:asciiTheme="minorHAnsi" w:hAnsiTheme="minorHAnsi" w:cstheme="minorHAnsi"/>
+        </w:rPr>
+        <w:t xml:space="preserve"> – częstotliwość napięcia zasilającego [Hz];</w:t>
+      </w:r>
+    </w:p>
+    <w:p>
+      <w:pPr>
+        <w:ind w:firstLine="284"/>
+        <w:jc w:val="both"/>
+        <w:rPr>
+          <w:rFonts w:asciiTheme="minorHAnsi" w:hAnsiTheme="minorHAnsi" w:cstheme="minorHAnsi"/>
+        </w:rPr>
+      </w:pPr>
+      <w:r>
+        <w:rPr>
+          <w:rFonts w:asciiTheme="minorHAnsi" w:hAnsiTheme="minorHAnsi" w:cstheme="minorHAnsi"/>
+          <w:i/>
+        </w:rPr>
+        <w:t xml:space="preserve">p</w:t>
+      </w:r>
+      <w:r>
+        <w:rPr>
+          <w:rFonts w:asciiTheme="minorHAnsi" w:hAnsiTheme="minorHAnsi" w:cstheme="minorHAnsi"/>
+        </w:rPr>
+        <w:t xml:space="preserve"> – liczba par biegunów [-].</w:t>
+      </w:r>
+    </w:p>
+    <w:p>
+      <w:pPr>
+        <w:ind w:firstLine="284"/>
+        <w:jc w:val="both"/>
+        <w:rPr>
+          <w:rFonts w:asciiTheme="minorHAnsi" w:hAnsiTheme="minorHAnsi" w:cstheme="minorHAnsi"/>
+        </w:rPr>
+      </w:pPr>
+      <w:r>
+        <w:rPr>
+          <w:rFonts w:asciiTheme="minorHAnsi" w:hAnsiTheme="minorHAnsi" w:cstheme="minorHAnsi"/>
+        </w:rPr>
+        <w:t xml:space="preserve">Prędkość obrotową odpowiadającą poślizgowi krytycznemu obliczono, przekształcając wzór na poślizg s = (n</w:t>
+      </w:r>
+      <w:r>
+        <w:rPr>
+          <w:rFonts w:asciiTheme="minorHAnsi" w:hAnsiTheme="minorHAnsi" w:cstheme="minorHAnsi"/>
+          <w:vertAlign w:val="subscript"/>
+        </w:rPr>
+        <w:t xml:space="preserve">s</w:t>
+      </w:r>
+      <w:r>
+        <w:rPr>
+          <w:rFonts w:asciiTheme="minorHAnsi" w:hAnsiTheme="minorHAnsi" w:cstheme="minorHAnsi"/>
+        </w:rPr>
+        <w:t xml:space="preserve"> – n)/n</w:t>
+      </w:r>
+      <w:r>
+        <w:rPr>
+          <w:rFonts w:asciiTheme="minorHAnsi" w:hAnsiTheme="minorHAnsi" w:cstheme="minorHAnsi"/>
+          <w:vertAlign w:val="subscript"/>
+        </w:rPr>
+        <w:t xml:space="preserve">s</w:t>
+      </w:r>
+      <w:r>
+        <w:rPr>
+          <w:rFonts w:asciiTheme="minorHAnsi" w:hAnsiTheme="minorHAnsi" w:cstheme="minorHAnsi"/>
+        </w:rPr>
+        <w:t xml:space="preserve">:</w:t>
+      </w:r>
+    </w:p>
+    <w:p>
+      <w:pPr>
+        <w:ind w:firstLine="284"/>
+        <w:jc w:val="both"/>
+        <w:rPr>
+          <w:rFonts w:asciiTheme="minorHAnsi" w:hAnsiTheme="minorHAnsi" w:cstheme="minorHAnsi"/>
+        </w:rPr>
+      </w:pPr>
+    </w:p>
+    <w:p>
+      <w:pPr>
+        <w:jc w:val="right"/>
+        <w:rPr>
+          <w:rFonts w:asciiTheme="minorHAnsi" w:hAnsiTheme="minorHAnsi" w:cstheme="minorHAnsi"/>
+        </w:rPr>
+      </w:pPr>
+      <m:oMath>
+        <m:sSub>
+          <m:e>
+            <m:r>
+              <w:rPr>
+                <w:rFonts w:ascii="Cambria Math" w:hAnsi="Cambria Math"/>
+              </w:rPr>
+              <m:t xml:space="preserve">n</m:t>
+            </m:r>
+          </m:e>
+          <m:sub>
+            <m:r>
+              <m:rPr>
+                <m:sty m:val="p"/>
+              </m:rPr>
+              <w:rPr>
+                <w:rFonts w:ascii="Cambria Math" w:hAnsi="Cambria Math"/>
+              </w:rPr>
+              <m:t xml:space="preserve">k</m:t>
+            </m:r>
+          </m:sub>
+        </m:sSub>
+        <m:r>
+          <w:rPr>
+            <w:rFonts w:ascii="Cambria Math" w:hAnsi="Cambria Math"/>
+          </w:rPr>
+          <m:t xml:space="preserve">=</m:t>
+        </m:r>
+        <m:sSub>
+          <m:e>
+            <m:r>
+              <w:rPr>
+                <w:rFonts w:ascii="Cambria Math" w:hAnsi="Cambria Math"/>
+              </w:rPr>
+              <m:t xml:space="preserve">n</m:t>
+            </m:r>
+          </m:e>
+          <m:sub>
+            <m:r>
+              <m:rPr>
+                <m:sty m:val="p"/>
+              </m:rPr>
+              <w:rPr>
+                <w:rFonts w:ascii="Cambria Math" w:hAnsi="Cambria Math"/>
+              </w:rPr>
+              <m:t xml:space="preserve">s</m:t>
+            </m:r>
+          </m:sub>
+        </m:sSub>
+        <m:r>
+          <w:rPr>
+            <w:rFonts w:ascii="Cambria Math" w:hAnsi="Cambria Math"/>
+          </w:rPr>
+          <m:t xml:space="preserve">∙(1-</m:t>
+        </m:r>
+        <m:sSub>
+          <m:e>
+            <m:r>
+              <w:rPr>
+                <w:rFonts w:ascii="Cambria Math" w:hAnsi="Cambria Math"/>
+              </w:rPr>
+              <m:t xml:space="preserve">s</m:t>
+            </m:r>
+          </m:e>
+          <m:sub>
+            <m:r>
+              <m:rPr>
+                <m:sty m:val="p"/>
+              </m:rPr>
+              <w:rPr>
+                <w:rFonts w:ascii="Cambria Math" w:hAnsi="Cambria Math"/>
+              </w:rPr>
+              <m:t xml:space="preserve">k</m:t>
+            </m:r>
+          </m:sub>
+        </m:sSub>
+        <m:r>
+          <w:rPr>
+            <w:rFonts w:ascii="Cambria Math" w:hAnsi="Cambria Math"/>
+          </w:rPr>
+          <m:t xml:space="preserve">)</m:t>
+        </m:r>
+      </m:oMath>
+      <w:r>
+        <w:rPr>
+          <w:rFonts w:asciiTheme="minorHAnsi" w:hAnsiTheme="minorHAnsi" w:cstheme="minorHAnsi"/>
+        </w:rPr>
+        <w:t xml:space="preserve"> </w:t>
+      </w:r>
+      <w:r>
+        <w:rPr>
+          <w:rFonts w:asciiTheme="minorHAnsi" w:hAnsiTheme="minorHAnsi" w:cstheme="minorHAnsi"/>
+        </w:rPr>
+        <w:tab/>
+      </w:r>
+      <w:r>
+        <w:rPr>
+          <w:rFonts w:asciiTheme="minorHAnsi" w:hAnsiTheme="minorHAnsi" w:cstheme="minorHAnsi"/>
+        </w:rPr>
+        <w:tab/>
+      </w:r>
+      <w:r>
+        <w:rPr>
+          <w:rFonts w:asciiTheme="minorHAnsi" w:hAnsiTheme="minorHAnsi" w:cstheme="minorHAnsi"/>
+        </w:rPr>
+        <w:tab/>
+      </w:r>
+      <w:r>
+        <w:rPr>
+          <w:rFonts w:asciiTheme="minorHAnsi" w:hAnsiTheme="minorHAnsi" w:cstheme="minorHAnsi"/>
+        </w:rPr>
+        <w:tab/>
+      </w:r>
+      <w:r>
+        <w:rPr>
+          <w:rFonts w:asciiTheme="minorHAnsi" w:hAnsiTheme="minorHAnsi" w:cstheme="minorHAnsi"/>
+        </w:rPr>
+        <w:tab/>
+      </w:r>
+      <w:r>
+        <w:rPr>
+          <w:rFonts w:asciiTheme="minorHAnsi" w:hAnsiTheme="minorHAnsi" w:cstheme="minorHAnsi"/>
+        </w:rPr>
+        <w:t>(2)</w:t>
+      </w:r>
+    </w:p>
+    <w:p>
+      <w:pPr>
+        <w:rPr>
+          <w:rFonts w:asciiTheme="minorHAnsi" w:hAnsiTheme="minorHAnsi" w:cstheme="minorHAnsi"/>
+        </w:rPr>
+      </w:pPr>
+      <w:r>
+        <w:rPr>
+          <w:rFonts w:asciiTheme="minorHAnsi" w:hAnsiTheme="minorHAnsi" w:cstheme="minorHAnsi"/>
+        </w:rPr>
+        <w:t>gdzie:</w:t>
+      </w:r>
+    </w:p>
+    <w:p>
+      <w:pPr>
+        <w:ind w:firstLine="284"/>
+        <w:jc w:val="both"/>
+        <w:rPr>
+          <w:rFonts w:asciiTheme="minorHAnsi" w:hAnsiTheme="minorHAnsi" w:cstheme="minorHAnsi"/>
+        </w:rPr>
+      </w:pPr>
+      <w:r>
+        <w:rPr>
+          <w:rFonts w:asciiTheme="minorHAnsi" w:hAnsiTheme="minorHAnsi" w:cstheme="minorHAnsi"/>
+          <w:i/>
+        </w:rPr>
+        <w:t xml:space="preserve">n</w:t>
+      </w:r>
+      <w:r>
+        <w:rPr>
+          <w:rFonts w:asciiTheme="minorHAnsi" w:hAnsiTheme="minorHAnsi" w:cstheme="minorHAnsi"/>
+          <w:i/>
+          <w:vertAlign w:val="subscript"/>
+        </w:rPr>
+        <w:t xml:space="preserve">k</w:t>
+      </w:r>
+      <w:r>
+        <w:rPr>
+          <w:rFonts w:asciiTheme="minorHAnsi" w:hAnsiTheme="minorHAnsi" w:cstheme="minorHAnsi"/>
+        </w:rPr>
+        <w:t xml:space="preserve"> – prędkość obrotowa krytyczna [obr/min];</w:t>
+      </w:r>
+    </w:p>
+    <w:p>
+      <w:pPr>
+        <w:ind w:firstLine="284"/>
+        <w:jc w:val="both"/>
+        <w:rPr>
+          <w:rFonts w:asciiTheme="minorHAnsi" w:hAnsiTheme="minorHAnsi" w:cstheme="minorHAnsi"/>
+        </w:rPr>
+      </w:pPr>
+      <w:r>
+        <w:rPr>
+          <w:rFonts w:asciiTheme="minorHAnsi" w:hAnsiTheme="minorHAnsi" w:cstheme="minorHAnsi"/>
+          <w:i/>
+        </w:rPr>
+        <w:t xml:space="preserve">n</w:t>
+      </w:r>
+      <w:r>
+        <w:rPr>
+          <w:rFonts w:asciiTheme="minorHAnsi" w:hAnsiTheme="minorHAnsi" w:cstheme="minorHAnsi"/>
+          <w:i/>
+          <w:vertAlign w:val="subscript"/>
+        </w:rPr>
+        <w:t xml:space="preserve">s</w:t>
+      </w:r>
+      <w:r>
+        <w:rPr>
+          <w:rFonts w:asciiTheme="minorHAnsi" w:hAnsiTheme="minorHAnsi" w:cstheme="minorHAnsi"/>
+        </w:rPr>
+        <w:t xml:space="preserve"> – prędkość synchroniczna [obr/min];</w:t>
+      </w:r>
+    </w:p>
+    <w:p>
+      <w:pPr>
+        <w:ind w:firstLine="284"/>
+        <w:jc w:val="both"/>
+        <w:rPr>
+          <w:rFonts w:asciiTheme="minorHAnsi" w:hAnsiTheme="minorHAnsi" w:cstheme="minorHAnsi"/>
+        </w:rPr>
+      </w:pPr>
+      <w:r>
+        <w:rPr>
+          <w:rFonts w:asciiTheme="minorHAnsi" w:hAnsiTheme="minorHAnsi" w:cstheme="minorHAnsi"/>
+          <w:i/>
+        </w:rPr>
+        <w:t xml:space="preserve">s</w:t>
+      </w:r>
+      <w:r>
+        <w:rPr>
+          <w:rFonts w:asciiTheme="minorHAnsi" w:hAnsiTheme="minorHAnsi" w:cstheme="minorHAnsi"/>
+          <w:i/>
+          <w:vertAlign w:val="subscript"/>
+        </w:rPr>
+        <w:t xml:space="preserve">k</w:t>
+      </w:r>
+      <w:r>
+        <w:rPr>
+          <w:rFonts w:asciiTheme="minorHAnsi" w:hAnsiTheme="minorHAnsi" w:cstheme="minorHAnsi"/>
+        </w:rPr>
+        <w:t xml:space="preserve"> – poślizg krytyczny [-].</w:t>
+      </w:r>
+    </w:p>
+    <w:p>
+      <w:pPr>
+        <w:ind w:firstLine="284"/>
+        <w:jc w:val="both"/>
+        <w:rPr>
+          <w:rFonts w:asciiTheme="minorHAnsi" w:hAnsiTheme="minorHAnsi" w:cstheme="minorHAnsi"/>
+        </w:rPr>
+      </w:pPr>
+      <w:r>
+        <w:rPr>
+          <w:rFonts w:asciiTheme="minorHAnsi" w:hAnsiTheme="minorHAnsi" w:cstheme="minorHAnsi"/>
+        </w:rPr>
+        <w:t xml:space="preserve">Wyniki obliczeń według wzoru (2) dla obu wartości napięcia zasilania zestawiono w tabeli 4.1.</w:t>
+      </w:r>
+    </w:p>
+    <w:p>
+      <w:pPr>
+        <w:ind w:firstLine="284"/>
+        <w:jc w:val="both"/>
+        <w:rPr>
+          <w:rFonts w:asciiTheme="minorHAnsi" w:hAnsiTheme="minorHAnsi" w:cstheme="minorHAnsi"/>
+        </w:rPr>
+      </w:pPr>
+    </w:p>
+    <w:p>
+      <w:pPr>
+        <w:pStyle w:val="Tabela"/>
+        <w:spacing w:before="0" w:line="240" w:lineRule="auto"/>
+        <w:ind w:left="709"/>
+        <w:jc w:val="left"/>
+        <w:rPr>
+          <w:rFonts w:asciiTheme="minorHAnsi" w:hAnsiTheme="minorHAnsi" w:cstheme="minorHAnsi"/>
+          <w:b w:val="0"/>
+          <w:bCs w:val="0"/>
+          <w:sz w:val="22"/>
+        </w:rPr>
+      </w:pPr>
+      <w:r>
+        <w:rPr>
+          <w:rFonts w:asciiTheme="minorHAnsi" w:hAnsiTheme="minorHAnsi" w:cstheme="minorHAnsi"/>
+          <w:b w:val="0"/>
+          <w:bCs w:val="0"/>
+          <w:sz w:val="22"/>
+        </w:rPr>
+        <w:t xml:space="preserve">Tab. 4.1. Parametry krytyczne silnika</w:t>
+      </w:r>
+    </w:p>
+    <w:tbl>
+      <w:tblPr>
+        <w:tblW w:w="0" w:type="auto"/>
         <w:jc w:val="center"/>
-        <w:rPr>
-          <w:rFonts w:asciiTheme="minorHAnsi" w:hAnsiTheme="minorHAnsi" w:cstheme="minorHAnsi"/>
-          <w:i w:val="0"/>
-          <w:color w:val="auto"/>
-          <w:sz w:val="22"/>
-          <w:szCs w:val="22"/>
-        </w:rPr>
-      </w:pPr>
-      <w:r>
-        <w:rPr>
-          <w:rFonts w:asciiTheme="minorHAnsi" w:hAnsiTheme="minorHAnsi"/>
-          <w:i w:val="0"/>
-          <w:color w:val="auto"/>
-          <w:sz w:val="22"/>
-          <w:szCs w:val="22"/>
-        </w:rPr>
-        <w:t xml:space="preserve">Rys. 3.2. Przebieg wartości skutecznych prądów fazowych podczas rozruchu – pomiar 1</w:t>
-      </w:r>
-    </w:p>
+        <w:tblBorders>
+          <w:top w:val="single" w:sz="6" w:space="0" w:color="000000"/>
+          <w:left w:val="single" w:sz="6" w:space="0" w:color="000000"/>
+          <w:bottom w:val="single" w:sz="6" w:space="0" w:color="000000"/>
+          <w:right w:val="single" w:sz="6" w:space="0" w:color="000000"/>
+          <w:insideH w:val="single" w:sz="6" w:space="0" w:color="000000"/>
+          <w:insideV w:val="single" w:sz="6" w:space="0" w:color="000000"/>
+        </w:tblBorders>
+        <w:tblLayout w:type="fixed"/>
+        <w:tblLook w:val="0000" w:firstRow="0" w:lastRow="0" w:firstColumn="0" w:lastColumn="0" w:noHBand="0" w:noVBand="0"/>
+      </w:tblPr>
+      <w:tblGrid>
+        <w:gridCol w:w="1927"/>
+        <w:gridCol w:w="1701"/>
+        <w:gridCol w:w="1701"/>
+        <w:gridCol w:w="1701"/>
+      </w:tblGrid>
+      <w:tr>
+        <w:trPr>
+          <w:cantSplit/>
+          <w:trHeight w:hRule="exact" w:val="370"/>
+          <w:jc w:val="center"/>
+          <w:tblHeader/>
+        </w:trPr>
+        <w:tc>
+          <w:tcPr>
+            <w:tcW w:w="1927" w:type="dxa"/>
+            <w:vAlign w:val="center"/>
+          </w:tcPr>
+          <w:p>
+            <w:pPr>
+              <w:pStyle w:val="Tabela-wntrze"/>
+              <w:keepNext/>
+              <w:spacing w:before="0" w:after="0"/>
+              <w:rPr>
+                <w:rFonts w:asciiTheme="minorHAnsi" w:hAnsiTheme="minorHAnsi" w:cstheme="minorHAnsi"/>
+                <w:sz w:val="22"/>
+              </w:rPr>
+            </w:pPr>
+            <w:r>
+              <w:rPr>
+                <w:rFonts w:asciiTheme="minorHAnsi" w:hAnsiTheme="minorHAnsi" w:cstheme="minorHAnsi"/>
+                <w:sz w:val="22"/>
+              </w:rPr>
+              <w:t xml:space="preserve">U</w:t>
+            </w:r>
+            <w:r>
+              <w:rPr>
+                <w:rFonts w:asciiTheme="minorHAnsi" w:hAnsiTheme="minorHAnsi" w:cstheme="minorHAnsi"/>
+                <w:sz w:val="22"/>
+                <w:vertAlign w:val="subscript"/>
+              </w:rPr>
+              <w:t xml:space="preserve">zas</w:t>
+            </w:r>
+            <w:r>
+              <w:rPr>
+                <w:rFonts w:asciiTheme="minorHAnsi" w:hAnsiTheme="minorHAnsi" w:cstheme="minorHAnsi"/>
+                <w:sz w:val="22"/>
+              </w:rPr>
+              <w:t xml:space="preserve"> [% U</w:t>
+            </w:r>
+            <w:r>
+              <w:rPr>
+                <w:rFonts w:asciiTheme="minorHAnsi" w:hAnsiTheme="minorHAnsi" w:cstheme="minorHAnsi"/>
+                <w:sz w:val="22"/>
+                <w:vertAlign w:val="subscript"/>
+              </w:rPr>
+              <w:t xml:space="preserve">N</w:t>
+            </w:r>
+            <w:r>
+              <w:rPr>
+                <w:rFonts w:asciiTheme="minorHAnsi" w:hAnsiTheme="minorHAnsi" w:cstheme="minorHAnsi"/>
+                <w:sz w:val="22"/>
+              </w:rPr>
+              <w:t xml:space="preserve">]</w:t>
+            </w:r>
+          </w:p>
+        </w:tc>
+        <w:tc>
+          <w:tcPr>
+            <w:tcW w:w="1701" w:type="dxa"/>
+            <w:vAlign w:val="center"/>
+          </w:tcPr>
+          <w:p>
+            <w:pPr>
+              <w:pStyle w:val="Tabela-wntrze"/>
+              <w:keepNext/>
+              <w:spacing w:before="0" w:after="0"/>
+              <w:rPr>
+                <w:rFonts w:asciiTheme="minorHAnsi" w:hAnsiTheme="minorHAnsi" w:cstheme="minorHAnsi"/>
+                <w:sz w:val="22"/>
+              </w:rPr>
+            </w:pPr>
+            <w:r>
+              <w:rPr>
+                <w:rFonts w:asciiTheme="minorHAnsi" w:hAnsiTheme="minorHAnsi" w:cstheme="minorHAnsi"/>
+                <w:sz w:val="22"/>
+              </w:rPr>
+              <w:t xml:space="preserve">M</w:t>
+            </w:r>
+            <w:r>
+              <w:rPr>
+                <w:rFonts w:asciiTheme="minorHAnsi" w:hAnsiTheme="minorHAnsi" w:cstheme="minorHAnsi"/>
+                <w:sz w:val="22"/>
+                <w:vertAlign w:val="subscript"/>
+              </w:rPr>
+              <w:t xml:space="preserve">k</w:t>
+            </w:r>
+            <w:r>
+              <w:rPr>
+                <w:rFonts w:asciiTheme="minorHAnsi" w:hAnsiTheme="minorHAnsi" w:cstheme="minorHAnsi"/>
+                <w:sz w:val="22"/>
+              </w:rPr>
+              <w:t xml:space="preserve"> [N·m]</w:t>
+            </w:r>
+          </w:p>
+        </w:tc>
+        <w:tc>
+          <w:tcPr>
+            <w:tcW w:w="1701" w:type="dxa"/>
+            <w:vAlign w:val="center"/>
+          </w:tcPr>
+          <w:p>
+            <w:pPr>
+              <w:pStyle w:val="Tabela-wntrze"/>
+              <w:keepNext/>
+              <w:spacing w:before="0" w:after="0"/>
+              <w:rPr>
+                <w:rFonts w:asciiTheme="minorHAnsi" w:hAnsiTheme="minorHAnsi" w:cstheme="minorHAnsi"/>
+                <w:sz w:val="22"/>
+              </w:rPr>
+            </w:pPr>
+            <w:r>
+              <w:rPr>
+                <w:rFonts w:asciiTheme="minorHAnsi" w:hAnsiTheme="minorHAnsi" w:cstheme="minorHAnsi"/>
+                <w:sz w:val="22"/>
+              </w:rPr>
+              <w:t xml:space="preserve">s</w:t>
+            </w:r>
+            <w:r>
+              <w:rPr>
+                <w:rFonts w:asciiTheme="minorHAnsi" w:hAnsiTheme="minorHAnsi" w:cstheme="minorHAnsi"/>
+                <w:sz w:val="22"/>
+                <w:vertAlign w:val="subscript"/>
+              </w:rPr>
+              <w:t xml:space="preserve">k</w:t>
+            </w:r>
+            <w:r>
+              <w:rPr>
+                <w:rFonts w:asciiTheme="minorHAnsi" w:hAnsiTheme="minorHAnsi" w:cstheme="minorHAnsi"/>
+                <w:sz w:val="22"/>
+              </w:rPr>
+              <w:t xml:space="preserve"> [-]</w:t>
+            </w:r>
+          </w:p>
+        </w:tc>
+        <w:tc>
+          <w:tcPr>
+            <w:tcW w:w="1701" w:type="dxa"/>
+            <w:vAlign w:val="center"/>
+          </w:tcPr>
+          <w:p>
+            <w:pPr>
+              <w:pStyle w:val="Tabela-wntrze"/>
+              <w:keepNext/>
+              <w:spacing w:before="0" w:after="0"/>
+              <w:rPr>
+                <w:rFonts w:asciiTheme="minorHAnsi" w:hAnsiTheme="minorHAnsi" w:cstheme="minorHAnsi"/>
+                <w:sz w:val="22"/>
+              </w:rPr>
+            </w:pPr>
+            <w:r>
+              <w:rPr>
+                <w:rFonts w:asciiTheme="minorHAnsi" w:hAnsiTheme="minorHAnsi" w:cstheme="minorHAnsi"/>
+                <w:sz w:val="22"/>
+              </w:rPr>
+              <w:t xml:space="preserve">n</w:t>
+            </w:r>
+            <w:r>
+              <w:rPr>
+                <w:rFonts w:asciiTheme="minorHAnsi" w:hAnsiTheme="minorHAnsi" w:cstheme="minorHAnsi"/>
+                <w:sz w:val="22"/>
+                <w:vertAlign w:val="subscript"/>
+              </w:rPr>
+              <w:t xml:space="preserve">k</w:t>
+            </w:r>
+            <w:r>
+              <w:rPr>
+                <w:rFonts w:asciiTheme="minorHAnsi" w:hAnsiTheme="minorHAnsi" w:cstheme="minorHAnsi"/>
+                <w:sz w:val="22"/>
+              </w:rPr>
+              <w:t xml:space="preserve"> [obr/min]</w:t>
+            </w:r>
+          </w:p>
+        </w:tc>
+      </w:tr>
+      <w:tr>
+        <w:trPr>
+          <w:cantSplit/>
+          <w:trHeight w:hRule="exact" w:val="370"/>
+          <w:jc w:val="center"/>
+        </w:trPr>
+        <w:tc>
+          <w:tcPr>
+            <w:tcW w:w="1927" w:type="dxa"/>
+            <w:vAlign w:val="center"/>
+          </w:tcPr>
+          <w:p>
+            <w:pPr>
+              <w:pStyle w:val="Tabela-wntrze"/>
+              <w:keepNext/>
+              <w:spacing w:before="0" w:after="0"/>
+              <w:rPr>
+                <w:rFonts w:asciiTheme="minorHAnsi" w:hAnsiTheme="minorHAnsi" w:cstheme="minorHAnsi"/>
+                <w:sz w:val="22"/>
+              </w:rPr>
+            </w:pPr>
+            <w:r>
+              <w:rPr>
+                <w:rFonts w:asciiTheme="minorHAnsi" w:hAnsiTheme="minorHAnsi" w:cstheme="minorHAnsi"/>
+                <w:sz w:val="22"/>
+              </w:rPr>
+              <w:t xml:space="preserve">70 %</w:t>
+            </w:r>
+          </w:p>
+        </w:tc>
+        <w:tc>
+          <w:tcPr>
+            <w:tcW w:w="1701" w:type="dxa"/>
+            <w:vAlign w:val="center"/>
+          </w:tcPr>
+          <w:p>
+            <w:pPr>
+              <w:pStyle w:val="Tabela-wntrze"/>
+              <w:keepNext/>
+              <w:spacing w:before="0" w:after="0"/>
+              <w:rPr>
+                <w:rFonts w:asciiTheme="minorHAnsi" w:hAnsiTheme="minorHAnsi" w:cstheme="minorHAnsi"/>
+                <w:sz w:val="22"/>
+              </w:rPr>
+            </w:pPr>
+            <w:r>
+              <w:rPr>
+                <w:rFonts w:asciiTheme="minorHAnsi" w:hAnsiTheme="minorHAnsi" w:cstheme="minorHAnsi"/>
+                <w:sz w:val="22"/>
+              </w:rPr>
+              <w:t xml:space="preserve">0,71</w:t>
+            </w:r>
+          </w:p>
+        </w:tc>
+        <w:tc>
+          <w:tcPr>
+            <w:tcW w:w="1701" w:type="dxa"/>
+            <w:vAlign w:val="center"/>
+          </w:tcPr>
+          <w:p>
+            <w:pPr>
+              <w:pStyle w:val="Tabela-wntrze"/>
+              <w:keepNext/>
+              <w:spacing w:before="0" w:after="0"/>
+              <w:rPr>
+                <w:rFonts w:asciiTheme="minorHAnsi" w:hAnsiTheme="minorHAnsi" w:cstheme="minorHAnsi"/>
+                <w:sz w:val="22"/>
+              </w:rPr>
+            </w:pPr>
+            <w:r>
+              <w:rPr>
+                <w:rFonts w:asciiTheme="minorHAnsi" w:hAnsiTheme="minorHAnsi" w:cstheme="minorHAnsi"/>
+                <w:sz w:val="22"/>
+              </w:rPr>
+              <w:t xml:space="preserve">0,63</w:t>
+            </w:r>
+          </w:p>
+        </w:tc>
+        <w:tc>
+          <w:tcPr>
+            <w:tcW w:w="1701" w:type="dxa"/>
+            <w:vAlign w:val="center"/>
+          </w:tcPr>
+          <w:p>
+            <w:pPr>
+              <w:pStyle w:val="Tabela-wntrze"/>
+              <w:keepNext/>
+              <w:spacing w:before="0" w:after="0"/>
+              <w:rPr>
+                <w:rFonts w:asciiTheme="minorHAnsi" w:hAnsiTheme="minorHAnsi" w:cstheme="minorHAnsi"/>
+                <w:sz w:val="22"/>
+              </w:rPr>
+            </w:pPr>
+            <w:r>
+              <w:rPr>
+                <w:rFonts w:asciiTheme="minorHAnsi" w:hAnsiTheme="minorHAnsi" w:cstheme="minorHAnsi"/>
+                <w:sz w:val="22"/>
+              </w:rPr>
+              <w:t xml:space="preserve">555</w:t>
+            </w:r>
+          </w:p>
+        </w:tc>
+      </w:tr>
+      <w:tr>
+        <w:trPr>
+          <w:cantSplit/>
+          <w:trHeight w:hRule="exact" w:val="370"/>
+          <w:jc w:val="center"/>
+        </w:trPr>
+        <w:tc>
+          <w:tcPr>
+            <w:tcW w:w="1927" w:type="dxa"/>
+            <w:vAlign w:val="center"/>
+          </w:tcPr>
+          <w:p>
+            <w:pPr>
+              <w:pStyle w:val="Tabela-wntrze"/>
+              <w:spacing w:before="0" w:after="0"/>
+              <w:rPr>
+                <w:rFonts w:asciiTheme="minorHAnsi" w:hAnsiTheme="minorHAnsi" w:cstheme="minorHAnsi"/>
+                <w:sz w:val="22"/>
+              </w:rPr>
+            </w:pPr>
+            <w:r>
+              <w:rPr>
+                <w:rFonts w:asciiTheme="minorHAnsi" w:hAnsiTheme="minorHAnsi" w:cstheme="minorHAnsi"/>
+                <w:sz w:val="22"/>
+              </w:rPr>
+              <w:t xml:space="preserve">55 %</w:t>
+            </w:r>
+          </w:p>
+        </w:tc>
+        <w:tc>
+          <w:tcPr>
+            <w:tcW w:w="1701" w:type="dxa"/>
+            <w:vAlign w:val="center"/>
+          </w:tcPr>
+          <w:p>
+            <w:pPr>
+              <w:pStyle w:val="Tabela-wntrze"/>
+              <w:spacing w:before="0" w:after="0"/>
+              <w:rPr>
+                <w:rFonts w:asciiTheme="minorHAnsi" w:hAnsiTheme="minorHAnsi" w:cstheme="minorHAnsi"/>
+                <w:sz w:val="22"/>
+              </w:rPr>
+            </w:pPr>
+            <w:r>
+              <w:rPr>
+                <w:rFonts w:asciiTheme="minorHAnsi" w:hAnsiTheme="minorHAnsi" w:cstheme="minorHAnsi"/>
+                <w:sz w:val="22"/>
+              </w:rPr>
+              <w:t xml:space="preserve">0,47</w:t>
+            </w:r>
+          </w:p>
+        </w:tc>
+        <w:tc>
+          <w:tcPr>
+            <w:tcW w:w="1701" w:type="dxa"/>
+            <w:vAlign w:val="center"/>
+          </w:tcPr>
+          <w:p>
+            <w:pPr>
+              <w:pStyle w:val="Tabela-wntrze"/>
+              <w:spacing w:before="0" w:after="0"/>
+              <w:rPr>
+                <w:rFonts w:asciiTheme="minorHAnsi" w:hAnsiTheme="minorHAnsi" w:cstheme="minorHAnsi"/>
+                <w:sz w:val="22"/>
+              </w:rPr>
+            </w:pPr>
+            <w:r>
+              <w:rPr>
+                <w:rFonts w:asciiTheme="minorHAnsi" w:hAnsiTheme="minorHAnsi" w:cstheme="minorHAnsi"/>
+                <w:sz w:val="22"/>
+              </w:rPr>
+              <w:t xml:space="preserve">0,61</w:t>
+            </w:r>
+          </w:p>
+        </w:tc>
+        <w:tc>
+          <w:tcPr>
+            <w:tcW w:w="1701" w:type="dxa"/>
+            <w:vAlign w:val="center"/>
+          </w:tcPr>
+          <w:p>
+            <w:pPr>
+              <w:pStyle w:val="Tabela-wntrze"/>
+              <w:spacing w:before="0" w:after="0"/>
+              <w:rPr>
+                <w:rFonts w:asciiTheme="minorHAnsi" w:hAnsiTheme="minorHAnsi" w:cstheme="minorHAnsi"/>
+                <w:sz w:val="22"/>
+              </w:rPr>
+            </w:pPr>
+            <w:r>
+              <w:rPr>
+                <w:rFonts w:asciiTheme="minorHAnsi" w:hAnsiTheme="minorHAnsi" w:cstheme="minorHAnsi"/>
+                <w:sz w:val="22"/>
+              </w:rPr>
+              <w:t xml:space="preserve">585</w:t>
+            </w:r>
+          </w:p>
+        </w:tc>
+      </w:tr>
+    </w:tbl>
     <w:p>
       <w:pPr>
         <w:ind w:firstLine="284"/>
@@ -10264,83 +12608,37 @@
           <w:rFonts w:asciiTheme="minorHAnsi" w:hAnsiTheme="minorHAnsi" w:cstheme="minorHAnsi"/>
         </w:rPr>
       </w:pPr>
-    </w:p>
-    <w:p>
-      <w:pPr>
-        <w:keepNext/>
-        <w:jc w:val="center"/>
-      </w:pPr>
-      <w:r>
-        <w:rPr>
-          <w:rFonts w:asciiTheme="minorHAnsi" w:hAnsiTheme="minorHAnsi" w:cstheme="minorHAnsi"/>
-          <w:noProof/>
-          <w:snapToGrid/>
-        </w:rPr>
-        <w:drawing>
-          <wp:inline distT="0" distB="0" distL="0" distR="0">
-            <wp:extent cx="5580000" cy="2834285"/>
-            <wp:effectExtent l="0" t="0" r="4445" b="5715"/>
-            <wp:docPr id="105" name="Obraz 105"/>
-            <wp:cNvGraphicFramePr>
-              <a:graphicFrameLocks xmlns:a="http://schemas.openxmlformats.org/drawingml/2006/main" noChangeAspect="1"/>
-            </wp:cNvGraphicFramePr>
-            <a:graphic xmlns:a="http://schemas.openxmlformats.org/drawingml/2006/main">
-              <a:graphicData uri="http://schemas.openxmlformats.org/drawingml/2006/picture">
-                <pic:pic xmlns:pic="http://schemas.openxmlformats.org/drawingml/2006/picture">
-                  <pic:nvPicPr>
-                    <pic:cNvPr id="1" name=""/>
-                    <pic:cNvPicPr/>
-                  </pic:nvPicPr>
-                  <pic:blipFill rotWithShape="1">
-                    <a:blip r:embed="rId18"/>
-                    <a:stretch/>
-                  </pic:blipFill>
-                  <pic:spPr bwMode="auto">
-                    <a:xfrm>
-                      <a:off x="0" y="0"/>
-                      <a:ext cx="5580000" cy="2834285"/>
-                    </a:xfrm>
-                    <a:prstGeom prst="rect">
-                      <a:avLst/>
-                    </a:prstGeom>
-                    <a:ln>
-                      <a:noFill/>
-                    </a:ln>
-                    <a:extLst>
-                      <a:ext uri="{53640926-AAD7-44D8-BBD7-CCE9431645EC}">
-                        <a14:shadowObscured xmlns:a14="http://schemas.microsoft.com/office/drawing/2010/main"/>
-                      </a:ext>
-                    </a:extLst>
-                  </pic:spPr>
-                </pic:pic>
-              </a:graphicData>
-            </a:graphic>
-          </wp:inline>
-        </w:drawing>
-      </w:r>
-    </w:p>
-    <w:p>
-      <w:pPr>
-        <w:pStyle w:val="Legenda"/>
-        <w:spacing w:after="0"/>
-        <w:jc w:val="center"/>
-        <w:rPr>
-          <w:rFonts w:asciiTheme="minorHAnsi" w:hAnsiTheme="minorHAnsi" w:cstheme="minorHAnsi"/>
-          <w:i w:val="0"/>
-          <w:color w:val="auto"/>
-          <w:sz w:val="22"/>
-          <w:szCs w:val="22"/>
-        </w:rPr>
-      </w:pPr>
-      <w:r>
-        <w:rPr>
-          <w:rFonts w:asciiTheme="minorHAnsi" w:hAnsiTheme="minorHAnsi"/>
-          <w:i w:val="0"/>
-          <w:color w:val="auto"/>
-          <w:sz w:val="22"/>
-          <w:szCs w:val="22"/>
-        </w:rPr>
-        <w:t xml:space="preserve">Rys. 3.3. Przebieg wartości skutecznych prądów fazowych podczas rozruchu – pomiar 2</w:t>
+      <w:r>
+        <w:rPr>
+          <w:rFonts w:asciiTheme="minorHAnsi" w:hAnsiTheme="minorHAnsi" w:cstheme="minorHAnsi"/>
+        </w:rPr>
+        <w:t xml:space="preserve">Zgodnie z teorią moment krytyczny silnika asynchronicznego jest proporcjonalny do kwadratu napięcia zasilania, natomiast poślizg krytyczny od napięcia nie zależy. Teoretyczną wartość momentu krytycznego przy napięciu 55 % U</w:t>
+      </w:r>
+      <w:r>
+        <w:rPr>
+          <w:rFonts w:asciiTheme="minorHAnsi" w:hAnsiTheme="minorHAnsi" w:cstheme="minorHAnsi"/>
+          <w:vertAlign w:val="subscript"/>
+        </w:rPr>
+        <w:t xml:space="preserve">N</w:t>
+      </w:r>
+      <w:r>
+        <w:rPr>
+          <w:rFonts w:asciiTheme="minorHAnsi" w:hAnsiTheme="minorHAnsi" w:cstheme="minorHAnsi"/>
+        </w:rPr>
+        <w:t xml:space="preserve">, wyznaczoną na podstawie pomiaru przy 70 % U</w:t>
+      </w:r>
+      <w:r>
+        <w:rPr>
+          <w:rFonts w:asciiTheme="minorHAnsi" w:hAnsiTheme="minorHAnsi" w:cstheme="minorHAnsi"/>
+          <w:vertAlign w:val="subscript"/>
+        </w:rPr>
+        <w:t xml:space="preserve">N</w:t>
+      </w:r>
+      <w:r>
+        <w:rPr>
+          <w:rFonts w:asciiTheme="minorHAnsi" w:hAnsiTheme="minorHAnsi" w:cstheme="minorHAnsi"/>
+        </w:rPr>
+        <w:t xml:space="preserve">, obliczono ze wzoru:</w:t>
       </w:r>
     </w:p>
     <w:p>
@@ -10354,89 +12652,270 @@
     </w:p>
     <w:p>
       <w:pPr>
-        <w:ind w:firstLine="284"/>
-        <w:jc w:val="both"/>
+        <w:jc w:val="right"/>
         <w:rPr>
           <w:rFonts w:asciiTheme="minorHAnsi" w:hAnsiTheme="minorHAnsi" w:cstheme="minorHAnsi"/>
         </w:rPr>
       </w:pPr>
+      <m:oMath>
+        <m:sSub>
+          <m:e>
+            <m:r>
+              <w:rPr>
+                <w:rFonts w:ascii="Cambria Math" w:hAnsi="Cambria Math"/>
+              </w:rPr>
+              <m:t xml:space="preserve">M</m:t>
+            </m:r>
+          </m:e>
+          <m:sub>
+            <m:r>
+              <m:rPr>
+                <m:sty m:val="p"/>
+              </m:rPr>
+              <w:rPr>
+                <w:rFonts w:ascii="Cambria Math" w:hAnsi="Cambria Math"/>
+              </w:rPr>
+              <m:t xml:space="preserve">k2,teor</m:t>
+            </m:r>
+          </m:sub>
+        </m:sSub>
+        <m:r>
+          <w:rPr>
+            <w:rFonts w:ascii="Cambria Math" w:hAnsi="Cambria Math"/>
+          </w:rPr>
+          <m:t xml:space="preserve">=</m:t>
+        </m:r>
+        <m:sSub>
+          <m:e>
+            <m:r>
+              <w:rPr>
+                <w:rFonts w:ascii="Cambria Math" w:hAnsi="Cambria Math"/>
+              </w:rPr>
+              <m:t xml:space="preserve">M</m:t>
+            </m:r>
+          </m:e>
+          <m:sub>
+            <m:r>
+              <m:rPr>
+                <m:sty m:val="p"/>
+              </m:rPr>
+              <w:rPr>
+                <w:rFonts w:ascii="Cambria Math" w:hAnsi="Cambria Math"/>
+              </w:rPr>
+              <m:t xml:space="preserve">k1</m:t>
+            </m:r>
+          </m:sub>
+        </m:sSub>
+        <m:r>
+          <w:rPr>
+            <w:rFonts w:ascii="Cambria Math" w:hAnsi="Cambria Math"/>
+          </w:rPr>
+          <m:t xml:space="preserve">∙</m:t>
+        </m:r>
+        <m:sSup>
+          <m:e>
+            <m:d>
+              <m:e>
+                <m:f>
+                  <m:num>
+                    <m:sSub>
+                      <m:e>
+                        <m:r>
+                          <w:rPr>
+                            <w:rFonts w:ascii="Cambria Math" w:hAnsi="Cambria Math"/>
+                          </w:rPr>
+                          <m:t xml:space="preserve">U</m:t>
+                        </m:r>
+                      </m:e>
+                      <m:sub>
+                        <m:r>
+                          <m:rPr>
+                            <m:sty m:val="p"/>
+                          </m:rPr>
+                          <w:rPr>
+                            <w:rFonts w:ascii="Cambria Math" w:hAnsi="Cambria Math"/>
+                          </w:rPr>
+                          <m:t xml:space="preserve">2</m:t>
+                        </m:r>
+                      </m:sub>
+                    </m:sSub>
+                  </m:num>
+                  <m:den>
+                    <m:sSub>
+                      <m:e>
+                        <m:r>
+                          <w:rPr>
+                            <w:rFonts w:ascii="Cambria Math" w:hAnsi="Cambria Math"/>
+                          </w:rPr>
+                          <m:t xml:space="preserve">U</m:t>
+                        </m:r>
+                      </m:e>
+                      <m:sub>
+                        <m:r>
+                          <m:rPr>
+                            <m:sty m:val="p"/>
+                          </m:rPr>
+                          <w:rPr>
+                            <w:rFonts w:ascii="Cambria Math" w:hAnsi="Cambria Math"/>
+                          </w:rPr>
+                          <m:t xml:space="preserve">1</m:t>
+                        </m:r>
+                      </m:sub>
+                    </m:sSub>
+                  </m:den>
+                </m:f>
+              </m:e>
+            </m:d>
+          </m:e>
+          <m:sup>
+            <m:r>
+              <w:rPr>
+                <w:rFonts w:ascii="Cambria Math" w:hAnsi="Cambria Math"/>
+              </w:rPr>
+              <m:t xml:space="preserve">2</m:t>
+            </m:r>
+          </m:sup>
+        </m:sSup>
+        <m:r>
+          <w:rPr>
+            <w:rFonts w:ascii="Cambria Math" w:hAnsi="Cambria Math"/>
+          </w:rPr>
+          <m:t xml:space="preserve">=</m:t>
+        </m:r>
+        <m:r>
+          <m:rPr>
+            <m:nor/>
+          </m:rPr>
+          <w:rPr>
+            <w:rFonts w:ascii="Cambria Math" w:hAnsi="Cambria Math"/>
+          </w:rPr>
+          <m:t xml:space="preserve">0,71</m:t>
+        </m:r>
+        <m:r>
+          <w:rPr>
+            <w:rFonts w:ascii="Cambria Math" w:hAnsi="Cambria Math"/>
+          </w:rPr>
+          <m:t xml:space="preserve">∙</m:t>
+        </m:r>
+        <m:sSup>
+          <m:e>
+            <m:d>
+              <m:e>
+                <m:f>
+                  <m:num>
+                    <m:r>
+                      <m:rPr>
+                        <m:nor/>
+                      </m:rPr>
+                      <w:rPr>
+                        <w:rFonts w:ascii="Cambria Math" w:hAnsi="Cambria Math"/>
+                      </w:rPr>
+                      <m:t xml:space="preserve">55 %</m:t>
+                    </m:r>
+                  </m:num>
+                  <m:den>
+                    <m:r>
+                      <m:rPr>
+                        <m:nor/>
+                      </m:rPr>
+                      <w:rPr>
+                        <w:rFonts w:ascii="Cambria Math" w:hAnsi="Cambria Math"/>
+                      </w:rPr>
+                      <m:t xml:space="preserve">70 %</m:t>
+                    </m:r>
+                  </m:den>
+                </m:f>
+              </m:e>
+            </m:d>
+          </m:e>
+          <m:sup>
+            <m:r>
+              <w:rPr>
+                <w:rFonts w:ascii="Cambria Math" w:hAnsi="Cambria Math"/>
+              </w:rPr>
+              <m:t xml:space="preserve">2</m:t>
+            </m:r>
+          </m:sup>
+        </m:sSup>
+        <m:r>
+          <w:rPr>
+            <w:rFonts w:ascii="Cambria Math" w:hAnsi="Cambria Math"/>
+          </w:rPr>
+          <m:t xml:space="preserve">≈</m:t>
+        </m:r>
+        <m:r>
+          <m:rPr>
+            <m:nor/>
+          </m:rPr>
+          <w:rPr>
+            <w:rFonts w:ascii="Cambria Math" w:hAnsi="Cambria Math"/>
+          </w:rPr>
+          <m:t xml:space="preserve">0,44</m:t>
+        </m:r>
+        <m:r>
+          <m:rPr>
+            <m:nor/>
+          </m:rPr>
+          <w:rPr>
+            <w:rFonts w:ascii="Cambria Math" w:hAnsi="Cambria Math"/>
+          </w:rPr>
+          <m:t xml:space="preserve"> N∙m</m:t>
+        </m:r>
+      </m:oMath>
+      <w:r>
+        <w:rPr>
+          <w:rFonts w:asciiTheme="minorHAnsi" w:hAnsiTheme="minorHAnsi" w:cstheme="minorHAnsi"/>
+        </w:rPr>
+        <w:t xml:space="preserve"> </w:t>
+      </w:r>
+      <w:r>
+        <w:rPr>
+          <w:rFonts w:asciiTheme="minorHAnsi" w:hAnsiTheme="minorHAnsi" w:cstheme="minorHAnsi"/>
+        </w:rPr>
+        <w:tab/>
+      </w:r>
+      <w:r>
+        <w:rPr>
+          <w:rFonts w:asciiTheme="minorHAnsi" w:hAnsiTheme="minorHAnsi" w:cstheme="minorHAnsi"/>
+        </w:rPr>
+        <w:tab/>
+      </w:r>
+      <w:r>
+        <w:rPr>
+          <w:rFonts w:asciiTheme="minorHAnsi" w:hAnsiTheme="minorHAnsi" w:cstheme="minorHAnsi"/>
+        </w:rPr>
+        <w:tab/>
+      </w:r>
+      <w:r>
+        <w:rPr>
+          <w:rFonts w:asciiTheme="minorHAnsi" w:hAnsiTheme="minorHAnsi" w:cstheme="minorHAnsi"/>
+        </w:rPr>
+        <w:tab/>
+      </w:r>
+      <w:r>
+        <w:rPr>
+          <w:rFonts w:asciiTheme="minorHAnsi" w:hAnsiTheme="minorHAnsi" w:cstheme="minorHAnsi"/>
+        </w:rPr>
+        <w:tab/>
+      </w:r>
+      <w:r>
+        <w:rPr>
+          <w:rFonts w:asciiTheme="minorHAnsi" w:hAnsiTheme="minorHAnsi" w:cstheme="minorHAnsi"/>
+        </w:rPr>
+        <w:t>(3)</w:t>
+      </w:r>
     </w:p>
     <w:p>
       <w:pPr>
-        <w:keepNext/>
-        <w:jc w:val="center"/>
+        <w:rPr>
+          <w:rFonts w:asciiTheme="minorHAnsi" w:hAnsiTheme="minorHAnsi" w:cstheme="minorHAnsi"/>
+        </w:rPr>
       </w:pPr>
       <w:r>
         <w:rPr>
           <w:rFonts w:asciiTheme="minorHAnsi" w:hAnsiTheme="minorHAnsi" w:cstheme="minorHAnsi"/>
-          <w:noProof/>
-          <w:snapToGrid/>
-        </w:rPr>
-        <w:drawing>
-          <wp:inline distT="0" distB="0" distL="0" distR="0">
-            <wp:extent cx="5580000" cy="2834285"/>
-            <wp:effectExtent l="0" t="0" r="4445" b="5715"/>
-            <wp:docPr id="106" name="Obraz 106"/>
-            <wp:cNvGraphicFramePr>
-              <a:graphicFrameLocks xmlns:a="http://schemas.openxmlformats.org/drawingml/2006/main" noChangeAspect="1"/>
-            </wp:cNvGraphicFramePr>
-            <a:graphic xmlns:a="http://schemas.openxmlformats.org/drawingml/2006/main">
-              <a:graphicData uri="http://schemas.openxmlformats.org/drawingml/2006/picture">
-                <pic:pic xmlns:pic="http://schemas.openxmlformats.org/drawingml/2006/picture">
-                  <pic:nvPicPr>
-                    <pic:cNvPr id="1" name=""/>
-                    <pic:cNvPicPr/>
-                  </pic:nvPicPr>
-                  <pic:blipFill rotWithShape="1">
-                    <a:blip r:embed="rId19"/>
-                    <a:stretch/>
-                  </pic:blipFill>
-                  <pic:spPr bwMode="auto">
-                    <a:xfrm>
-                      <a:off x="0" y="0"/>
-                      <a:ext cx="5580000" cy="2834285"/>
-                    </a:xfrm>
-                    <a:prstGeom prst="rect">
-                      <a:avLst/>
-                    </a:prstGeom>
-                    <a:ln>
-                      <a:noFill/>
-                    </a:ln>
-                    <a:extLst>
-                      <a:ext uri="{53640926-AAD7-44D8-BBD7-CCE9431645EC}">
-                        <a14:shadowObscured xmlns:a14="http://schemas.microsoft.com/office/drawing/2010/main"/>
-                      </a:ext>
-                    </a:extLst>
-                  </pic:spPr>
-                </pic:pic>
-              </a:graphicData>
-            </a:graphic>
-          </wp:inline>
-        </w:drawing>
-      </w:r>
-    </w:p>
-    <w:p>
-      <w:pPr>
-        <w:pStyle w:val="Legenda"/>
-        <w:spacing w:after="0"/>
-        <w:jc w:val="center"/>
-        <w:rPr>
-          <w:rFonts w:asciiTheme="minorHAnsi" w:hAnsiTheme="minorHAnsi" w:cstheme="minorHAnsi"/>
-          <w:i w:val="0"/>
-          <w:color w:val="auto"/>
-          <w:sz w:val="22"/>
-          <w:szCs w:val="22"/>
-        </w:rPr>
-      </w:pPr>
-      <w:r>
-        <w:rPr>
-          <w:rFonts w:asciiTheme="minorHAnsi" w:hAnsiTheme="minorHAnsi"/>
-          <w:i w:val="0"/>
-          <w:color w:val="auto"/>
-          <w:sz w:val="22"/>
-          <w:szCs w:val="22"/>
-        </w:rPr>
-        <w:t xml:space="preserve">Rys. 3.4. Przebieg wartości skutecznych prądów fazowych podczas rozruchu – pomiar 3</w:t>
+        </w:rPr>
+        <w:t>gdzie:</w:t>
       </w:r>
     </w:p>
     <w:p>
@@ -10447,6 +12926,53 @@
           <w:rFonts w:asciiTheme="minorHAnsi" w:hAnsiTheme="minorHAnsi" w:cstheme="minorHAnsi"/>
         </w:rPr>
       </w:pPr>
+      <w:r>
+        <w:rPr>
+          <w:rFonts w:asciiTheme="minorHAnsi" w:hAnsiTheme="minorHAnsi" w:cstheme="minorHAnsi"/>
+          <w:i/>
+        </w:rPr>
+        <w:t xml:space="preserve">M</w:t>
+      </w:r>
+      <w:r>
+        <w:rPr>
+          <w:rFonts w:asciiTheme="minorHAnsi" w:hAnsiTheme="minorHAnsi" w:cstheme="minorHAnsi"/>
+          <w:i/>
+          <w:vertAlign w:val="subscript"/>
+        </w:rPr>
+        <w:t xml:space="preserve">k1</w:t>
+      </w:r>
+      <w:r>
+        <w:rPr>
+          <w:rFonts w:asciiTheme="minorHAnsi" w:hAnsiTheme="minorHAnsi" w:cstheme="minorHAnsi"/>
+        </w:rPr>
+        <w:t xml:space="preserve"> – moment krytyczny zmierzony przy napięciu U</w:t>
+      </w:r>
+      <w:r>
+        <w:rPr>
+          <w:rFonts w:asciiTheme="minorHAnsi" w:hAnsiTheme="minorHAnsi" w:cstheme="minorHAnsi"/>
+          <w:vertAlign w:val="subscript"/>
+        </w:rPr>
+        <w:t xml:space="preserve">1</w:t>
+      </w:r>
+      <w:r>
+        <w:rPr>
+          <w:rFonts w:asciiTheme="minorHAnsi" w:hAnsiTheme="minorHAnsi" w:cstheme="minorHAnsi"/>
+        </w:rPr>
+        <w:t xml:space="preserve"> = 70 % U</w:t>
+      </w:r>
+      <w:r>
+        <w:rPr>
+          <w:rFonts w:asciiTheme="minorHAnsi" w:hAnsiTheme="minorHAnsi" w:cstheme="minorHAnsi"/>
+          <w:vertAlign w:val="subscript"/>
+        </w:rPr>
+        <w:t xml:space="preserve">N</w:t>
+      </w:r>
+      <w:r>
+        <w:rPr>
+          <w:rFonts w:asciiTheme="minorHAnsi" w:hAnsiTheme="minorHAnsi" w:cstheme="minorHAnsi"/>
+        </w:rPr>
+        <w:t xml:space="preserve"> [N·m];</w:t>
+      </w:r>
     </w:p>
     <w:p>
       <w:pPr>
@@ -10459,8 +12985,38 @@
       <w:r>
         <w:rPr>
           <w:rFonts w:asciiTheme="minorHAnsi" w:hAnsiTheme="minorHAnsi" w:cstheme="minorHAnsi"/>
-        </w:rPr>
-        <w:t xml:space="preserve">We wszystkich pomiarach prąd osiąga wartość maksymalną w ciągu pierwszych 1–2 s po załączeniu, a następnie szybko maleje do wartości ustalonej ok. 0,99 A. Najwyższe maksimum prądu zarejestrowano w pomiarze 1 (3,705 A), a najniższe – w pomiarze 2 (2,823 A). W pomiarze 2 maksimum fazy L1 zarejestrowano o jedną próbkę później niż w fazach L2 i L3, a w pomiarach 2 i 3 pierwsza niezerowa próbka ma wartość mniejszą niż druga. Wynika to z faktu, że miernik uśrednia wartość skuteczną w oknie 1 s, a chwila załączenia przypada w różnych miejscach tego okna – krótkotrwały impuls prądu rozruchowego jest więc „rozmywany” na jedną lub dwie próbki.</w:t>
+          <w:i/>
+        </w:rPr>
+        <w:t xml:space="preserve">U</w:t>
+      </w:r>
+      <w:r>
+        <w:rPr>
+          <w:rFonts w:asciiTheme="minorHAnsi" w:hAnsiTheme="minorHAnsi" w:cstheme="minorHAnsi"/>
+          <w:i/>
+          <w:vertAlign w:val="subscript"/>
+        </w:rPr>
+        <w:t xml:space="preserve">1</w:t>
+      </w:r>
+      <w:r>
+        <w:rPr>
+          <w:rFonts w:asciiTheme="minorHAnsi" w:hAnsiTheme="minorHAnsi" w:cstheme="minorHAnsi"/>
+          <w:i/>
+        </w:rPr>
+        <w:t xml:space="preserve">, U</w:t>
+      </w:r>
+      <w:r>
+        <w:rPr>
+          <w:rFonts w:asciiTheme="minorHAnsi" w:hAnsiTheme="minorHAnsi" w:cstheme="minorHAnsi"/>
+          <w:i/>
+          <w:vertAlign w:val="subscript"/>
+        </w:rPr>
+        <w:t xml:space="preserve">2</w:t>
+      </w:r>
+      <w:r>
+        <w:rPr>
+          <w:rFonts w:asciiTheme="minorHAnsi" w:hAnsiTheme="minorHAnsi" w:cstheme="minorHAnsi"/>
+        </w:rPr>
+        <w:t xml:space="preserve"> – napięcia zasilania w obu pomiarach [V].</w:t>
       </w:r>
     </w:p>
     <w:p>
@@ -10471,19 +13027,115 @@
           <w:rFonts w:asciiTheme="minorHAnsi" w:hAnsiTheme="minorHAnsi" w:cstheme="minorHAnsi"/>
         </w:rPr>
       </w:pPr>
-    </w:p>
-    <w:p>
-      <w:pPr>
-        <w:pStyle w:val="Nagwek1"/>
-        <w:rPr>
-          <w:sz w:val="28"/>
-        </w:rPr>
-      </w:pPr>
-      <w:r>
-        <w:rPr>
-          <w:sz w:val="28"/>
-        </w:rPr>
-        <w:t xml:space="preserve">Wyniki obliczeń</w:t>
+      <w:r>
+        <w:rPr>
+          <w:rFonts w:asciiTheme="minorHAnsi" w:hAnsiTheme="minorHAnsi" w:cstheme="minorHAnsi"/>
+        </w:rPr>
+        <w:t xml:space="preserve">Zmierzony moment krytyczny przy 55 % U</w:t>
+      </w:r>
+      <w:r>
+        <w:rPr>
+          <w:rFonts w:asciiTheme="minorHAnsi" w:hAnsiTheme="minorHAnsi" w:cstheme="minorHAnsi"/>
+          <w:vertAlign w:val="subscript"/>
+        </w:rPr>
+        <w:t xml:space="preserve">N</w:t>
+      </w:r>
+      <w:r>
+        <w:rPr>
+          <w:rFonts w:asciiTheme="minorHAnsi" w:hAnsiTheme="minorHAnsi" w:cstheme="minorHAnsi"/>
+        </w:rPr>
+        <w:t xml:space="preserve"> wynosi 0,47 N·m i jest o ok. 7 % większy od wartości teoretycznej 0,44 N·m. Stosunek zmierzonych momentów krytycznych wynosi M</w:t>
+      </w:r>
+      <w:r>
+        <w:rPr>
+          <w:rFonts w:asciiTheme="minorHAnsi" w:hAnsiTheme="minorHAnsi" w:cstheme="minorHAnsi"/>
+          <w:vertAlign w:val="subscript"/>
+        </w:rPr>
+        <w:t xml:space="preserve">k2</w:t>
+      </w:r>
+      <w:r>
+        <w:rPr>
+          <w:rFonts w:asciiTheme="minorHAnsi" w:hAnsiTheme="minorHAnsi" w:cstheme="minorHAnsi"/>
+        </w:rPr>
+        <w:t xml:space="preserve">/M</w:t>
+      </w:r>
+      <w:r>
+        <w:rPr>
+          <w:rFonts w:asciiTheme="minorHAnsi" w:hAnsiTheme="minorHAnsi" w:cstheme="minorHAnsi"/>
+          <w:vertAlign w:val="subscript"/>
+        </w:rPr>
+        <w:t xml:space="preserve">k1</w:t>
+      </w:r>
+      <w:r>
+        <w:rPr>
+          <w:rFonts w:asciiTheme="minorHAnsi" w:hAnsiTheme="minorHAnsi" w:cstheme="minorHAnsi"/>
+        </w:rPr>
+        <w:t xml:space="preserve"> = 0,662, a stosunek kwadratów napięć (U</w:t>
+      </w:r>
+      <w:r>
+        <w:rPr>
+          <w:rFonts w:asciiTheme="minorHAnsi" w:hAnsiTheme="minorHAnsi" w:cstheme="minorHAnsi"/>
+          <w:vertAlign w:val="subscript"/>
+        </w:rPr>
+        <w:t xml:space="preserve">2</w:t>
+      </w:r>
+      <w:r>
+        <w:rPr>
+          <w:rFonts w:asciiTheme="minorHAnsi" w:hAnsiTheme="minorHAnsi" w:cstheme="minorHAnsi"/>
+        </w:rPr>
+        <w:t xml:space="preserve">/U</w:t>
+      </w:r>
+      <w:r>
+        <w:rPr>
+          <w:rFonts w:asciiTheme="minorHAnsi" w:hAnsiTheme="minorHAnsi" w:cstheme="minorHAnsi"/>
+          <w:vertAlign w:val="subscript"/>
+        </w:rPr>
+        <w:t xml:space="preserve">1</w:t>
+      </w:r>
+      <w:r>
+        <w:rPr>
+          <w:rFonts w:asciiTheme="minorHAnsi" w:hAnsiTheme="minorHAnsi" w:cstheme="minorHAnsi"/>
+        </w:rPr>
+        <w:t xml:space="preserve">)</w:t>
+      </w:r>
+      <w:r>
+        <w:rPr>
+          <w:rFonts w:asciiTheme="minorHAnsi" w:hAnsiTheme="minorHAnsi" w:cstheme="minorHAnsi"/>
+          <w:vertAlign w:val="superscript"/>
+        </w:rPr>
+        <w:t xml:space="preserve">2</w:t>
+      </w:r>
+      <w:r>
+        <w:rPr>
+          <w:rFonts w:asciiTheme="minorHAnsi" w:hAnsiTheme="minorHAnsi" w:cstheme="minorHAnsi"/>
+        </w:rPr>
+        <w:t xml:space="preserve"> = 0,617. Poślizgi krytyczne w obu pomiarach różnią się tylko o 0,02. Dla porównania poślizg znamionowy silnika (n</w:t>
+      </w:r>
+      <w:r>
+        <w:rPr>
+          <w:rFonts w:asciiTheme="minorHAnsi" w:hAnsiTheme="minorHAnsi" w:cstheme="minorHAnsi"/>
+          <w:vertAlign w:val="subscript"/>
+        </w:rPr>
+        <w:t xml:space="preserve">N</w:t>
+      </w:r>
+      <w:r>
+        <w:rPr>
+          <w:rFonts w:asciiTheme="minorHAnsi" w:hAnsiTheme="minorHAnsi" w:cstheme="minorHAnsi"/>
+        </w:rPr>
+        <w:t xml:space="preserve"> = 1350 obr/min) wynosi s</w:t>
+      </w:r>
+      <w:r>
+        <w:rPr>
+          <w:rFonts w:asciiTheme="minorHAnsi" w:hAnsiTheme="minorHAnsi" w:cstheme="minorHAnsi"/>
+          <w:vertAlign w:val="subscript"/>
+        </w:rPr>
+        <w:t xml:space="preserve">N</w:t>
+      </w:r>
+      <w:r>
+        <w:rPr>
+          <w:rFonts w:asciiTheme="minorHAnsi" w:hAnsiTheme="minorHAnsi" w:cstheme="minorHAnsi"/>
+        </w:rPr>
+        <w:t xml:space="preserve"> = (1500 – 1350)/1500 = 0,10, a więc jest kilkukrotnie mniejszy od poślizgu krytycznego.</w:t>
       </w:r>
     </w:p>
     <w:p>
@@ -10498,7 +13150,7 @@
         <w:rPr>
           <w:rFonts w:asciiTheme="minorHAnsi" w:hAnsiTheme="minorHAnsi" w:cstheme="minorHAnsi"/>
         </w:rPr>
-        <w:t xml:space="preserve">Wartość prądu w stanie ustalonym dla każdej fazy obliczono jako średnią arytmetyczną próbek z zakresu stanu ustalonego (zaznaczonego na rysunkach 3.2–3.4):</w:t>
+        <w:t xml:space="preserve">Wartość prądu w stanie ustalonym dla każdej fazy obliczono jako średnią arytmetyczną próbek z zakresu stanu ustalonego (zakresy podano w tabeli 4.2):</w:t>
       </w:r>
     </w:p>
     <w:p>
@@ -10679,7 +13331,7 @@
         <w:rPr>
           <w:rFonts w:asciiTheme="minorHAnsi" w:hAnsiTheme="minorHAnsi" w:cstheme="minorHAnsi"/>
         </w:rPr>
-        <w:t>(1)</w:t>
+        <w:t>(4)</w:t>
       </w:r>
     </w:p>
     <w:p>
@@ -10978,7 +13630,7 @@
         <w:rPr>
           <w:rFonts w:asciiTheme="minorHAnsi" w:hAnsiTheme="minorHAnsi" w:cstheme="minorHAnsi"/>
         </w:rPr>
-        <w:t>(2)</w:t>
+        <w:t>(5)</w:t>
       </w:r>
     </w:p>
     <w:p>
@@ -11144,7 +13796,7 @@
         <w:rPr>
           <w:rFonts w:asciiTheme="minorHAnsi" w:hAnsiTheme="minorHAnsi" w:cstheme="minorHAnsi"/>
         </w:rPr>
-        <w:t>(3)</w:t>
+        <w:t>(6)</w:t>
       </w:r>
     </w:p>
     <w:p>
@@ -11368,7 +14020,7 @@
         <w:rPr>
           <w:rFonts w:asciiTheme="minorHAnsi" w:hAnsiTheme="minorHAnsi" w:cstheme="minorHAnsi"/>
         </w:rPr>
-        <w:t>(4)</w:t>
+        <w:t>(7)</w:t>
       </w:r>
     </w:p>
     <w:p>
@@ -11534,7 +14186,7 @@
         <w:rPr>
           <w:rFonts w:asciiTheme="minorHAnsi" w:hAnsiTheme="minorHAnsi" w:cstheme="minorHAnsi"/>
         </w:rPr>
-        <w:t>(5)</w:t>
+        <w:t>(8)</w:t>
       </w:r>
     </w:p>
     <w:p>
@@ -11577,7 +14229,7 @@
         <w:rPr>
           <w:rFonts w:asciiTheme="minorHAnsi" w:hAnsiTheme="minorHAnsi" w:cstheme="minorHAnsi"/>
         </w:rPr>
-        <w:t xml:space="preserve"> – średnia z trzech faz maksymalna wartość prądu podczas rozruchu, wzór (3) [A];</w:t>
+        <w:t xml:space="preserve"> – średnia z trzech faz maksymalna wartość prądu podczas rozruchu, wzór (6) [A];</w:t>
       </w:r>
     </w:p>
     <w:p>
@@ -11607,7 +14259,7 @@
         <w:rPr>
           <w:rFonts w:asciiTheme="minorHAnsi" w:hAnsiTheme="minorHAnsi" w:cstheme="minorHAnsi"/>
         </w:rPr>
-        <w:t xml:space="preserve"> – średnia z trzech faz wartość prądu w stanie ustalonym, wzór (2) [A];</w:t>
+        <w:t xml:space="preserve"> – średnia z trzech faz wartość prądu w stanie ustalonym, wzór (5) [A];</w:t>
       </w:r>
     </w:p>
     <w:p>
@@ -11652,7 +14304,7 @@
         <w:rPr>
           <w:rFonts w:asciiTheme="minorHAnsi" w:hAnsiTheme="minorHAnsi" w:cstheme="minorHAnsi"/>
         </w:rPr>
-        <w:t xml:space="preserve">Wyniki obliczeń wartości prądu w stanie ustalonym według wzorów (1) i (2) zestawiono w tabeli 4.1, a maksymalne wartości prądu podczas rozruchu i współczynniki krotności prądu obliczone według wzorów (3) i (4) – w tabeli 4.2.</w:t>
+        <w:t xml:space="preserve">Wyniki obliczeń wartości prądu w stanie ustalonym według wzorów (4) i (5) zestawiono w tabeli 4.2, a maksymalne wartości prądu podczas rozruchu i współczynniki krotności prądu obliczone według wzorów (6) i (7) – w tabeli 4.3.</w:t>
       </w:r>
     </w:p>
     <w:p>
@@ -11684,7 +14336,7 @@
           <w:bCs w:val="0"/>
           <w:sz w:val="22"/>
         </w:rPr>
-        <w:t xml:space="preserve">Tab. 4.1. Wartości prądu w stanie ustalonym</w:t>
+        <w:t xml:space="preserve">Tab. 4.2. Wartości prądu w stanie ustalonym</w:t>
       </w:r>
     </w:p>
     <w:tbl>
@@ -12504,7 +15156,7 @@
           <w:bCs w:val="0"/>
           <w:sz w:val="22"/>
         </w:rPr>
-        <w:t xml:space="preserve">Tab. 4.2. Maksymalne wartości prądu podczas rozruchu i współczynnik krotności prądu</w:t>
+        <w:t xml:space="preserve">Tab. 4.3. Maksymalne wartości prądu podczas rozruchu i współczynnik krotności prądu</w:t>
       </w:r>
     </w:p>
     <w:tbl>
@@ -13491,7 +16143,7 @@
         <w:rPr>
           <w:rFonts w:asciiTheme="minorHAnsi" w:hAnsiTheme="minorHAnsi" w:cstheme="minorHAnsi"/>
         </w:rPr>
-        <w:t xml:space="preserve">Średnia krotność wzrostu prądu z trzech pomiarów, obliczona według wzoru (5), wynosi:</w:t>
+        <w:t xml:space="preserve">Średnia krotność wzrostu prądu z trzech pomiarów, obliczona według wzoru (8), wynosi:</w:t>
       </w:r>
     </w:p>
     <w:p>
@@ -13618,7 +16270,7 @@
         <w:rPr>
           <w:rFonts w:asciiTheme="minorHAnsi" w:hAnsiTheme="minorHAnsi" w:cstheme="minorHAnsi"/>
         </w:rPr>
-        <w:t>(6)</w:t>
+        <w:t>(9)</w:t>
       </w:r>
     </w:p>
     <w:p>
@@ -13726,7 +16378,7 @@
         <w:rPr>
           <w:rFonts w:asciiTheme="minorHAnsi" w:hAnsiTheme="minorHAnsi" w:cstheme="minorHAnsi"/>
         </w:rPr>
-        <w:t xml:space="preserve">Na podstawie danych z tabliczki znamionowej (tab. 2.1) obliczono również prędkość synchroniczną, poślizg znamionowy oraz częstotliwość obrotów wirnika silnika napędzającego wentylator:</w:t>
+        <w:t xml:space="preserve">Na podstawie danych z tabliczki znamionowej (tab. 2.2) obliczono również prędkość synchroniczną, poślizg znamionowy oraz częstotliwość obrotów wirnika silnika napędzającego wentylator:</w:t>
       </w:r>
     </w:p>
     <w:p>
@@ -13892,7 +16544,7 @@
         <w:rPr>
           <w:rFonts w:asciiTheme="minorHAnsi" w:hAnsiTheme="minorHAnsi" w:cstheme="minorHAnsi"/>
         </w:rPr>
-        <w:t>(7)</w:t>
+        <w:t>(10)</w:t>
       </w:r>
     </w:p>
     <w:p>
@@ -14085,7 +16737,7 @@
         <w:rPr>
           <w:rFonts w:asciiTheme="minorHAnsi" w:hAnsiTheme="minorHAnsi" w:cstheme="minorHAnsi"/>
         </w:rPr>
-        <w:t>(8)</w:t>
+        <w:t>(11)</w:t>
       </w:r>
     </w:p>
     <w:p>
@@ -14236,7 +16888,7 @@
         <w:rPr>
           <w:rFonts w:asciiTheme="minorHAnsi" w:hAnsiTheme="minorHAnsi" w:cstheme="minorHAnsi"/>
         </w:rPr>
-        <w:t>(9)</w:t>
+        <w:t>(12)</w:t>
       </w:r>
     </w:p>
     <w:p>
@@ -14428,7 +17080,7 @@
         <w:rPr>
           <w:rFonts w:asciiTheme="minorHAnsi" w:hAnsiTheme="minorHAnsi" w:cstheme="minorHAnsi"/>
         </w:rPr>
-        <w:t xml:space="preserve">Poślizg znamionowy silnika wentylatora wynosi 8 %, a częstotliwość obrotów wirnika 46 Hz (2760 obr/min), co potwierdza poprawność wzoru (9): f = n</w:t>
+        <w:t xml:space="preserve">Poślizg znamionowy silnika wentylatora wynosi 8 %, a częstotliwość obrotów wirnika 46 Hz (2760 obr/min), co potwierdza poprawność wzoru (12): f = n</w:t>
       </w:r>
       <w:r>
         <w:rPr>
@@ -14478,7 +17130,7 @@
         <w:rPr>
           <w:rFonts w:asciiTheme="minorHAnsi" w:hAnsiTheme="minorHAnsi" w:cstheme="minorHAnsi"/>
         </w:rPr>
-        <w:t xml:space="preserve">Celem laboratorium było poznanie budowy, zasady działania i właściwości trójfazowego silnika asynchronicznego klatkowego, w tym określenie wartości prądu pobieranego podczas rozruchu i współczynnika krotności prądu rozruchowego.</w:t>
+        <w:t xml:space="preserve">Celem laboratorium było poznanie budowy, zasady działania i właściwości trójfazowego silnika asynchronicznego klatkowego, w tym wyznaczenie jego charakterystyki mechanicznej i parametrów krytycznych oraz określenie wartości prądu pobieranego podczas rozruchu i współczynnika krotności prądu rozruchowego.</w:t>
       </w:r>
     </w:p>
     <w:p>
@@ -14492,7 +17144,20 @@
         <w:rPr>
           <w:rFonts w:asciiTheme="minorHAnsi" w:hAnsiTheme="minorHAnsi" w:cstheme="minorHAnsi"/>
         </w:rPr>
-        <w:t xml:space="preserve">W celu realizacji zadania zarejestrowano wartości skuteczne prądów w trzech fazach zasilania podczas trzech rozruchów silnika napędzającego wentylator. Dla każdego pomiaru wyznaczono średni prąd w stanie ustalonym, średnią maksymalną wartość prądu podczas rozruchu oraz ich stosunek, a następnie średnią krotność wzrostu prądu.</w:t>
+        <w:t xml:space="preserve">W celu realizacji zadania wyznaczono charakterystyki mechaniczne M = f(s) silnika pro-MOTOR MS 71 1-4 przy napięciu zasilania 70 % i 55 % U</w:t>
+      </w:r>
+      <w:r>
+        <w:rPr>
+          <w:rFonts w:asciiTheme="minorHAnsi" w:hAnsiTheme="minorHAnsi" w:cstheme="minorHAnsi"/>
+          <w:vertAlign w:val="subscript"/>
+        </w:rPr>
+        <w:t xml:space="preserve">N</w:t>
+      </w:r>
+      <w:r>
+        <w:rPr>
+          <w:rFonts w:asciiTheme="minorHAnsi" w:hAnsiTheme="minorHAnsi" w:cstheme="minorHAnsi"/>
+        </w:rPr>
+        <w:t xml:space="preserve"> i odczytano z nich parametry krytyczne, a następnie zarejestrowano wartości skuteczne prądów w trzech fazach zasilania podczas trzech rozruchów silnika napędzającego wentylator. Dla każdego rozruchu wyznaczono średni prąd w stanie ustalonym, średnią maksymalną wartość prądu podczas rozruchu oraz ich stosunek, a następnie średnią krotność wzrostu prądu.</w:t>
       </w:r>
     </w:p>
     <w:p>
@@ -14506,20 +17171,124 @@
         <w:rPr>
           <w:rFonts w:asciiTheme="minorHAnsi" w:hAnsiTheme="minorHAnsi" w:cstheme="minorHAnsi"/>
         </w:rPr>
-        <w:t xml:space="preserve">Podczas rozruchu prąd pobierany przez silnik wzrastał od zera do wartości maksymalnej 2,58–3,65 A (średnio z trzech faz), a już po 1–2 s malał do wartości ustalonej ok. 0,99 A. Prądy w poszczególnych fazach w stanie ustalonym różniły się nieznacznie (prąd fazy L3 był o ok. 4–6 % mniejszy niż w fazach L1 i L2), co świadczy o niewielkiej asymetrii zasilania lub uzwojeń. Współczynnik krotności prądu w kolejnych pomiarach wyniósł 3,64, 2,58, 3,32, a średnia krotność wzrostu prądu k</w:t>
+        <w:t xml:space="preserve">Wyznaczone parametry krytyczne wynoszą: przy 70 % U</w:t>
       </w:r>
       <w:r>
         <w:rPr>
           <w:rFonts w:asciiTheme="minorHAnsi" w:hAnsiTheme="minorHAnsi" w:cstheme="minorHAnsi"/>
           <w:vertAlign w:val="subscript"/>
         </w:rPr>
-        <w:t xml:space="preserve">śr</w:t>
-      </w:r>
-      <w:r>
-        <w:rPr>
-          <w:rFonts w:asciiTheme="minorHAnsi" w:hAnsiTheme="minorHAnsi" w:cstheme="minorHAnsi"/>
-        </w:rPr>
-        <w:t xml:space="preserve"> ≈ 3,18.</w:t>
+        <w:t xml:space="preserve">N</w:t>
+      </w:r>
+      <w:r>
+        <w:rPr>
+          <w:rFonts w:asciiTheme="minorHAnsi" w:hAnsiTheme="minorHAnsi" w:cstheme="minorHAnsi"/>
+        </w:rPr>
+        <w:t xml:space="preserve"> – M</w:t>
+      </w:r>
+      <w:r>
+        <w:rPr>
+          <w:rFonts w:asciiTheme="minorHAnsi" w:hAnsiTheme="minorHAnsi" w:cstheme="minorHAnsi"/>
+          <w:vertAlign w:val="subscript"/>
+        </w:rPr>
+        <w:t xml:space="preserve">k</w:t>
+      </w:r>
+      <w:r>
+        <w:rPr>
+          <w:rFonts w:asciiTheme="minorHAnsi" w:hAnsiTheme="minorHAnsi" w:cstheme="minorHAnsi"/>
+        </w:rPr>
+        <w:t xml:space="preserve"> = 0,71 N·m, s</w:t>
+      </w:r>
+      <w:r>
+        <w:rPr>
+          <w:rFonts w:asciiTheme="minorHAnsi" w:hAnsiTheme="minorHAnsi" w:cstheme="minorHAnsi"/>
+          <w:vertAlign w:val="subscript"/>
+        </w:rPr>
+        <w:t xml:space="preserve">k</w:t>
+      </w:r>
+      <w:r>
+        <w:rPr>
+          <w:rFonts w:asciiTheme="minorHAnsi" w:hAnsiTheme="minorHAnsi" w:cstheme="minorHAnsi"/>
+        </w:rPr>
+        <w:t xml:space="preserve"> = 0,63 (n</w:t>
+      </w:r>
+      <w:r>
+        <w:rPr>
+          <w:rFonts w:asciiTheme="minorHAnsi" w:hAnsiTheme="minorHAnsi" w:cstheme="minorHAnsi"/>
+          <w:vertAlign w:val="subscript"/>
+        </w:rPr>
+        <w:t xml:space="preserve">k</w:t>
+      </w:r>
+      <w:r>
+        <w:rPr>
+          <w:rFonts w:asciiTheme="minorHAnsi" w:hAnsiTheme="minorHAnsi" w:cstheme="minorHAnsi"/>
+        </w:rPr>
+        <w:t xml:space="preserve"> ≈ 555 obr/min), a przy 55 % U</w:t>
+      </w:r>
+      <w:r>
+        <w:rPr>
+          <w:rFonts w:asciiTheme="minorHAnsi" w:hAnsiTheme="minorHAnsi" w:cstheme="minorHAnsi"/>
+          <w:vertAlign w:val="subscript"/>
+        </w:rPr>
+        <w:t xml:space="preserve">N</w:t>
+      </w:r>
+      <w:r>
+        <w:rPr>
+          <w:rFonts w:asciiTheme="minorHAnsi" w:hAnsiTheme="minorHAnsi" w:cstheme="minorHAnsi"/>
+        </w:rPr>
+        <w:t xml:space="preserve"> – M</w:t>
+      </w:r>
+      <w:r>
+        <w:rPr>
+          <w:rFonts w:asciiTheme="minorHAnsi" w:hAnsiTheme="minorHAnsi" w:cstheme="minorHAnsi"/>
+          <w:vertAlign w:val="subscript"/>
+        </w:rPr>
+        <w:t xml:space="preserve">k</w:t>
+      </w:r>
+      <w:r>
+        <w:rPr>
+          <w:rFonts w:asciiTheme="minorHAnsi" w:hAnsiTheme="minorHAnsi" w:cstheme="minorHAnsi"/>
+        </w:rPr>
+        <w:t xml:space="preserve"> = 0,47 N·m, s</w:t>
+      </w:r>
+      <w:r>
+        <w:rPr>
+          <w:rFonts w:asciiTheme="minorHAnsi" w:hAnsiTheme="minorHAnsi" w:cstheme="minorHAnsi"/>
+          <w:vertAlign w:val="subscript"/>
+        </w:rPr>
+        <w:t xml:space="preserve">k</w:t>
+      </w:r>
+      <w:r>
+        <w:rPr>
+          <w:rFonts w:asciiTheme="minorHAnsi" w:hAnsiTheme="minorHAnsi" w:cstheme="minorHAnsi"/>
+        </w:rPr>
+        <w:t xml:space="preserve"> = 0,61 (n</w:t>
+      </w:r>
+      <w:r>
+        <w:rPr>
+          <w:rFonts w:asciiTheme="minorHAnsi" w:hAnsiTheme="minorHAnsi" w:cstheme="minorHAnsi"/>
+          <w:vertAlign w:val="subscript"/>
+        </w:rPr>
+        <w:t xml:space="preserve">k</w:t>
+      </w:r>
+      <w:r>
+        <w:rPr>
+          <w:rFonts w:asciiTheme="minorHAnsi" w:hAnsiTheme="minorHAnsi" w:cstheme="minorHAnsi"/>
+        </w:rPr>
+        <w:t xml:space="preserve"> ≈ 585 obr/min). Obniżenie napięcia zasilania z 70 % do 55 % U</w:t>
+      </w:r>
+      <w:r>
+        <w:rPr>
+          <w:rFonts w:asciiTheme="minorHAnsi" w:hAnsiTheme="minorHAnsi" w:cstheme="minorHAnsi"/>
+          <w:vertAlign w:val="subscript"/>
+        </w:rPr>
+        <w:t xml:space="preserve">N</w:t>
+      </w:r>
+      <w:r>
+        <w:rPr>
+          <w:rFonts w:asciiTheme="minorHAnsi" w:hAnsiTheme="minorHAnsi" w:cstheme="minorHAnsi"/>
+        </w:rPr>
+        <w:t xml:space="preserve"> spowodowało spadek momentu krytycznego o ok. 34 %, przy praktycznie niezmienionym poślizgu krytycznym. Jest to zgodne z teorią: moment krytyczny jest proporcjonalny do kwadratu napięcia (wartość teoretyczna 0,44 N·m różni się od zmierzonej o ok. 7 %, co mieści się w granicach dokładności odczytu z charakterystyki), a poślizg krytyczny od napięcia nie zależy. Stabilna praca silnika jest możliwa dla poślizgów mniejszych od krytycznego, tj. przy prędkości większej niż ok. 585 obr/min. Obniżanie napięcia zmniejsza przeciążalność silnika, a prędkość obrotową zmienia jedynie w niewielkim zakresie, dlatego jest mało efektywną metodą regulacji prędkości.</w:t>
       </w:r>
     </w:p>
     <w:p>
@@ -14533,7 +17302,20 @@
         <w:rPr>
           <w:rFonts w:asciiTheme="minorHAnsi" w:hAnsiTheme="minorHAnsi" w:cstheme="minorHAnsi"/>
         </w:rPr>
-        <w:t xml:space="preserve">Uzyskana krotność jest mniejsza od wartości typowych dla rozruchu bezpośredniego silników klatkowych (zwykle 4–8). Wynika to przede wszystkim z rozdzielczości czasowej rejestracji – miernik zapisuje wartość skuteczną uśrednioną w oknie 1 s, natomiast prąd rozruchowy małego silnika z lekkim obciążeniem wentylatorowym trwa zaledwie kilkaset milisekund, przez co jego wartość szczytowa jest zaniżona. Potwierdza to rozrzut krotności pomiędzy pomiarami (2,58–3,64), wynikający z różnego położenia chwili załączenia względem okna pomiarowego. Ograniczenie prądu może wynikać również z rampy rozruchowej przemiennika częstotliwości, jeżeli silnik był przez niego zasilany.</w:t>
+        <w:t xml:space="preserve">Podczas rozruchu prąd pobierany przez silnik wzrastał od zera do wartości maksymalnej 2,58–3,65 A (średnio z trzech faz), a już po 1–2 s malał do wartości ustalonej ok. 0,99 A. Prądy w poszczególnych fazach w stanie ustalonym różniły się nieznacznie (prąd fazy L3 był o ok. 4–6 % mniejszy niż w fazach L1 i L2), co świadczy o niewielkiej asymetrii zasilania lub uzwojeń. Współczynnik krotności prądu w kolejnych pomiarach wyniósł 3,64, 2,58, 3,32, a średnia krotność wzrostu prądu k</w:t>
+      </w:r>
+      <w:r>
+        <w:rPr>
+          <w:rFonts w:asciiTheme="minorHAnsi" w:hAnsiTheme="minorHAnsi" w:cstheme="minorHAnsi"/>
+          <w:vertAlign w:val="subscript"/>
+        </w:rPr>
+        <w:t xml:space="preserve">śr</w:t>
+      </w:r>
+      <w:r>
+        <w:rPr>
+          <w:rFonts w:asciiTheme="minorHAnsi" w:hAnsiTheme="minorHAnsi" w:cstheme="minorHAnsi"/>
+        </w:rPr>
+        <w:t xml:space="preserve"> ≈ 3,18.</w:t>
       </w:r>
     </w:p>
     <w:p>
@@ -14547,7 +17329,21 @@
         <w:rPr>
           <w:rFonts w:asciiTheme="minorHAnsi" w:hAnsiTheme="minorHAnsi" w:cstheme="minorHAnsi"/>
         </w:rPr>
-        <w:t xml:space="preserve">W dalszych badaniach należałoby zarejestrować przebiegi prądu z większą częstotliwością próbkowania (np. oscyloskopem lub rejestratorem z okresem rzędu milisekund), co pozwoliłoby wyznaczyć rzeczywistą wartość szczytową prądu rozruchowego. Warto także porównać rozruch bezpośredni z rozruchem gwiazda–trójkąt oraz z rozruchem przez przemiennik częstotliwości z różnymi czasami rampy, aby ocenić skuteczność poszczególnych metod ograniczania prądu rozruchowego.</w:t>
+        <w:t xml:space="preserve">Uzyskana krotność jest mniejsza od wartości typowych dla rozruchu bezpośredniego silników klatkowych (zwykle 4–8). Wynika to przede wszystkim z rozdzielczości czasowej rejestracji – miernik zapisuje wartość skuteczną uśrednioną w oknie 1 s, natomiast prąd rozruchowy małego silnika z lekkim obciążeniem wentylatorowym trwa zaledwie kilkaset milisekund, przez co jego wartość szczytowa jest zaniżona. Potwierdza to rozrzut krotności pomiędzy pomiarami (2,58–3,64), wynikający z różnego położenia chwili załączenia względem okna pomiarowego. Ograniczenie prądu może wynikać również z rampy rozruchowej przemiennika częstotliwości, jeżeli silnik był przez niego zasilany.</w:t>
+      </w:r>
+    </w:p>
+    <w:p>
+      <w:pPr>
+        <w:ind w:firstLine="284"/>
+        <w:rPr>
+          <w:rFonts w:asciiTheme="minorHAnsi" w:hAnsiTheme="minorHAnsi" w:cstheme="minorHAnsi"/>
+        </w:rPr>
+      </w:pPr>
+      <w:r>
+        <w:rPr>
+          <w:rFonts w:asciiTheme="minorHAnsi" w:hAnsiTheme="minorHAnsi" w:cstheme="minorHAnsi"/>
+        </w:rPr>
+        <w:t xml:space="preserve">W dalszych badaniach należałoby zarejestrować przebiegi prądu z większą częstotliwością próbkowania (np. oscyloskopem lub rejestratorem z okresem rzędu milisekund), co pozwoliłoby wyznaczyć rzeczywistą wartość szczytową prądu rozruchowego. Warto także porównać rozruch bezpośredni z rozruchem gwiazda–trójkąt oraz z rozruchem przez przemiennik częstotliwości z różnymi czasami rampy, aby ocenić skuteczność poszczególnych metod ograniczania prądu rozruchowego. W przypadku charakterystyki mechanicznej warto powtórzyć pomiary przy napięciu znamionowym i przy różnych częstotliwościach zasilania, aby porównać wpływ obu metod sterowania na kształt charakterystyki.</w:t>
       </w:r>
     </w:p>
     <w:sectPr>

</xml_diff>